<commit_message>
Manual v8: variedades lingüísticas, voz neuronal y caos comunicativo
Actualiza el manual de casos de uso a la v8 en sus tres formatos (HTML,
DOCX y PDF):
- Nueva sección «Novedades de la versión 8» (tres variedades, voz neuronal
  offline, respeto dialectal, Panel del Adulto, frases portadoras).
- Dos casos de uso nuevos: CU-14 (elegir variedad) y CU-15 (Panel del
  Adulto · caos comunicativo).
- Amplía glosario y FAQ; actualiza portada y pie a v8.
- Regenera DOCX (build-docx.py) y PDF (Chromium headless desde el HTML).
- Ajusta la referencia del manual en el README.

Co-Authored-By: Claude Opus 4.8 <noreply@anthropic.com>
Claude-Session: https://claude.ai/code/session_01Fw1f1mscN65yNdJMti3hyG
</commit_message>
<xml_diff>
--- a/docs/Valeria-Manual-Casos-de-Uso.docx
+++ b/docs/Valeria-Manual-Casos-de-Uso.docx
@@ -61,7 +61,7 @@
           <w:color w:val="00A39E"/>
           <w:sz w:val="20"/>
         </w:rPr>
-        <w:t>Manual de usuario · v7 · con capturas de pantalla</w:t>
+        <w:t>Manual de usuario · v8 · con capturas de pantalla</w:t>
       </w:r>
     </w:p>
     <w:p>
@@ -107,7 +107,7 @@
         <w:br/>
         <w:t>Julio de 2026 · Documento interno</w:t>
         <w:br/>
-        <w:t>Expo SDK 54 / React Native · Backend opcional Firebase · Telemetría del piloto</w:t>
+        <w:t>Expo SDK 54 / React Native · Castellano · Galego · Dominicano · Voz neuronal offline</w:t>
       </w:r>
     </w:p>
     <w:p>
@@ -420,6 +420,38 @@
       </w:r>
       <w:r>
         <w:t>Exportar la evidencia de usabilidad del piloto (QR + compartir)</w:t>
+      </w:r>
+    </w:p>
+    <w:p>
+      <w:pPr>
+        <w:spacing w:after="60"/>
+        <w:ind w:left="227"/>
+      </w:pPr>
+      <w:r>
+        <w:rPr>
+          <w:b/>
+          <w:color w:val="00C4BE"/>
+        </w:rPr>
+        <w:t xml:space="preserve">CU-14   </w:t>
+      </w:r>
+      <w:r>
+        <w:t>Elegir la variedad de terapia (Castellano · Galego · Dominicano)</w:t>
+      </w:r>
+    </w:p>
+    <w:p>
+      <w:pPr>
+        <w:spacing w:after="60"/>
+        <w:ind w:left="227"/>
+      </w:pPr>
+      <w:r>
+        <w:rPr>
+          <w:b/>
+          <w:color w:val="00C4BE"/>
+        </w:rPr>
+        <w:t xml:space="preserve">CU-15   </w:t>
+      </w:r>
+      <w:r>
+        <w:t>Panel del Adulto: caos comunicativo (ruido, doble tarea, quiebre)</w:t>
       </w:r>
     </w:p>
     <w:p>
@@ -1222,6 +1254,222 @@
                 <w:sz w:val="19"/>
               </w:rPr>
               <w:t>Con el PIN profesional, la app genera a la vez un código QR con el resumen (offline, escaneable) y abre el menú de compartir para enviar el registro completo por email o WhatsApp cuando haya conexión (ver CU-13).</w:t>
+            </w:r>
+          </w:p>
+        </w:tc>
+      </w:tr>
+    </w:tbl>
+    <w:p>
+      <w:pPr>
+        <w:spacing w:after="40"/>
+      </w:pPr>
+    </w:p>
+    <w:p>
+      <w:pPr>
+        <w:pStyle w:val="Heading3"/>
+      </w:pPr>
+      <w:r>
+        <w:t>Novedades de la versión 8</w:t>
+      </w:r>
+    </w:p>
+    <w:p>
+      <w:pPr>
+        <w:spacing w:after="120"/>
+      </w:pPr>
+      <w:r>
+        <w:rPr>
+          <w:b w:val="0"/>
+          <w:i w:val="0"/>
+        </w:rPr>
+        <w:t>La versión 8 abre Valeria+ a más lenguas y variedades del habla y suma un paradigma de carga comunicativa controlada para el piloto. El contenido terapéutico (lo que se locuta, se muestra y se evalúa) puede sonar en tres variedades; la interfaz sigue en castellano.</w:t>
+      </w:r>
+    </w:p>
+    <w:tbl>
+      <w:tblPr>
+        <w:tblStyle w:val="TableGrid"/>
+        <w:tblW w:type="auto" w:w="0"/>
+        <w:jc w:val="center"/>
+        <w:tblLook w:firstColumn="1" w:firstRow="1" w:lastColumn="0" w:lastRow="0" w:noHBand="0" w:noVBand="1" w:val="04A0"/>
+      </w:tblPr>
+      <w:tblGrid>
+        <w:gridCol w:w="4819"/>
+        <w:gridCol w:w="4819"/>
+      </w:tblGrid>
+      <w:tr>
+        <w:tc>
+          <w:tcPr>
+            <w:tcW w:type="dxa" w:w="2721"/>
+            <w:shd w:val="clear" w:fill="E6F9F8"/>
+          </w:tcPr>
+          <w:p>
+            <w:r>
+              <w:rPr>
+                <w:b/>
+                <w:color w:val="00A39E"/>
+                <w:sz w:val="18"/>
+              </w:rPr>
+              <w:t>Novedad</w:t>
+            </w:r>
+          </w:p>
+        </w:tc>
+        <w:tc>
+          <w:tcPr>
+            <w:tcW w:type="dxa" w:w="6917"/>
+            <w:shd w:val="clear" w:fill="E6F9F8"/>
+          </w:tcPr>
+          <w:p>
+            <w:r>
+              <w:rPr>
+                <w:b/>
+                <w:color w:val="00A39E"/>
+                <w:sz w:val="18"/>
+              </w:rPr>
+              <w:t>Qué aporta</w:t>
+            </w:r>
+          </w:p>
+        </w:tc>
+      </w:tr>
+      <w:tr>
+        <w:tc>
+          <w:tcPr>
+            <w:tcW w:type="dxa" w:w="2721"/>
+          </w:tcPr>
+          <w:p>
+            <w:r>
+              <w:rPr>
+                <w:b/>
+                <w:sz w:val="19"/>
+              </w:rPr>
+              <w:t>🌍 Tres variedades</w:t>
+            </w:r>
+          </w:p>
+        </w:tc>
+        <w:tc>
+          <w:tcPr>
+            <w:tcW w:type="dxa" w:w="6917"/>
+          </w:tcPr>
+          <w:p>
+            <w:r>
+              <w:rPr>
+                <w:sz w:val="19"/>
+              </w:rPr>
+              <w:t>El contenido se locuta y evalúa en Castellano, Galego (Proxecto Nós) o Dominicano (es-DO, Quisqueya Habla), elegibles en la tarjeta “Voz de la app” (ver CU-14). Cada variedad usa su propio banco de pares mínimos.</w:t>
+            </w:r>
+          </w:p>
+        </w:tc>
+      </w:tr>
+      <w:tr>
+        <w:tc>
+          <w:tcPr>
+            <w:tcW w:type="dxa" w:w="2721"/>
+          </w:tcPr>
+          <w:p>
+            <w:r>
+              <w:rPr>
+                <w:b/>
+                <w:sz w:val="19"/>
+              </w:rPr>
+              <w:t>🔊 Voz neuronal offline</w:t>
+            </w:r>
+          </w:p>
+        </w:tc>
+        <w:tc>
+          <w:tcPr>
+            <w:tcW w:type="dxa" w:w="6917"/>
+          </w:tcPr>
+          <w:p>
+            <w:r>
+              <w:rPr>
+                <w:sz w:val="19"/>
+              </w:rPr>
+              <w:t>Castellano y gallego suenan con voces neuronales pregeneradas (Sharvard y Celtia) empaquetadas en la app: locución natural sin conexión ni servidor. Lo no cubierto recae con suavidad en la voz del sistema.</w:t>
+            </w:r>
+          </w:p>
+        </w:tc>
+      </w:tr>
+      <w:tr>
+        <w:tc>
+          <w:tcPr>
+            <w:tcW w:type="dxa" w:w="2721"/>
+          </w:tcPr>
+          <w:p>
+            <w:r>
+              <w:rPr>
+                <w:b/>
+                <w:sz w:val="19"/>
+              </w:rPr>
+              <w:t>🇩🇴 Respeto dialectal</w:t>
+            </w:r>
+          </w:p>
+        </w:tc>
+        <w:tc>
+          <w:tcPr>
+            <w:tcW w:type="dxa" w:w="6917"/>
+          </w:tcPr>
+          <w:p>
+            <w:r>
+              <w:rPr>
+                <w:sz w:val="19"/>
+              </w:rPr>
+              <w:t>En dominicano la app no marca como error los rasgos normales del habla caribeña (seseo, aspiración de la “s”, cambio de “r/l” a final de sílaba): evita falsos positivos que estigmaticen el habla de la familia.</w:t>
+            </w:r>
+          </w:p>
+        </w:tc>
+      </w:tr>
+      <w:tr>
+        <w:tc>
+          <w:tcPr>
+            <w:tcW w:type="dxa" w:w="2721"/>
+          </w:tcPr>
+          <w:p>
+            <w:r>
+              <w:rPr>
+                <w:b/>
+                <w:sz w:val="19"/>
+              </w:rPr>
+              <w:t>🎛️ Panel del Adulto · Caos Comunicativo</w:t>
+            </w:r>
+          </w:p>
+        </w:tc>
+        <w:tc>
+          <w:tcPr>
+            <w:tcW w:type="dxa" w:w="6917"/>
+          </w:tcPr>
+          <w:p>
+            <w:r>
+              <w:rPr>
+                <w:sz w:val="19"/>
+              </w:rPr>
+              <w:t>Tres módulos manuales para el piloto (escucha en ruido, oso distractor de doble tarea y quiebre pragmático). Los activa siempre el adulto: la app nunca ajusta nada sola (ver CU-15).</w:t>
+            </w:r>
+          </w:p>
+        </w:tc>
+      </w:tr>
+      <w:tr>
+        <w:tc>
+          <w:tcPr>
+            <w:tcW w:type="dxa" w:w="2721"/>
+          </w:tcPr>
+          <w:p>
+            <w:r>
+              <w:rPr>
+                <w:b/>
+                <w:sz w:val="19"/>
+              </w:rPr>
+              <w:t>💬 Frases portadoras</w:t>
+            </w:r>
+          </w:p>
+        </w:tc>
+        <w:tc>
+          <w:tcPr>
+            <w:tcW w:type="dxa" w:w="6917"/>
+          </w:tcPr>
+          <w:p>
+            <w:r>
+              <w:rPr>
+                <w:sz w:val="19"/>
+              </w:rPr>
+              <w:t>En Pares Mínimos la palabra objetivo ya no se dicta aislada: se incrusta en una frase con entonación natural seguida de una pregunta, sin repetirse en diez ensayos seguidos.</w:t>
             </w:r>
           </w:p>
         </w:tc>
@@ -2477,6 +2725,174 @@
           </w:p>
         </w:tc>
       </w:tr>
+      <w:tr>
+        <w:tc>
+          <w:tcPr>
+            <w:tcW w:type="dxa" w:w="2381"/>
+          </w:tcPr>
+          <w:p>
+            <w:r>
+              <w:rPr>
+                <w:sz w:val="19"/>
+              </w:rPr>
+              <w:t>Variedad</w:t>
+            </w:r>
+          </w:p>
+        </w:tc>
+        <w:tc>
+          <w:tcPr>
+            <w:tcW w:type="dxa" w:w="7257"/>
+          </w:tcPr>
+          <w:p>
+            <w:r>
+              <w:rPr>
+                <w:sz w:val="19"/>
+              </w:rPr>
+              <w:t>Lengua o forma del habla en que la app locuta y evalúa el contenido: Castellano, Galego (Proxecto Nós) o Dominicano (es-DO, Quisqueya Habla). Se elige en “Voz de la app”.</w:t>
+            </w:r>
+          </w:p>
+        </w:tc>
+      </w:tr>
+      <w:tr>
+        <w:tc>
+          <w:tcPr>
+            <w:tcW w:type="dxa" w:w="2381"/>
+          </w:tcPr>
+          <w:p>
+            <w:r>
+              <w:rPr>
+                <w:sz w:val="19"/>
+              </w:rPr>
+              <w:t>Voz neuronal</w:t>
+            </w:r>
+          </w:p>
+        </w:tc>
+        <w:tc>
+          <w:tcPr>
+            <w:tcW w:type="dxa" w:w="7257"/>
+          </w:tcPr>
+          <w:p>
+            <w:r>
+              <w:rPr>
+                <w:sz w:val="19"/>
+              </w:rPr>
+              <w:t>Locución pregenerada con modelos de voz de alta calidad (Sharvard en castellano, Celtia en gallego) empaquetada en la app; suena natural y funciona sin conexión.</w:t>
+            </w:r>
+          </w:p>
+        </w:tc>
+      </w:tr>
+      <w:tr>
+        <w:tc>
+          <w:tcPr>
+            <w:tcW w:type="dxa" w:w="2381"/>
+          </w:tcPr>
+          <w:p>
+            <w:r>
+              <w:rPr>
+                <w:sz w:val="19"/>
+              </w:rPr>
+              <w:t>Rasgo dialectal</w:t>
+            </w:r>
+          </w:p>
+        </w:tc>
+        <w:tc>
+          <w:tcPr>
+            <w:tcW w:type="dxa" w:w="7257"/>
+          </w:tcPr>
+          <w:p>
+            <w:r>
+              <w:rPr>
+                <w:sz w:val="19"/>
+              </w:rPr>
+              <w:t>Característica normal del habla de una región (p. ej. el seseo dominicano). No es un error clínico y la app no lo penaliza.</w:t>
+            </w:r>
+          </w:p>
+        </w:tc>
+      </w:tr>
+      <w:tr>
+        <w:tc>
+          <w:tcPr>
+            <w:tcW w:type="dxa" w:w="2381"/>
+          </w:tcPr>
+          <w:p>
+            <w:r>
+              <w:rPr>
+                <w:sz w:val="19"/>
+              </w:rPr>
+              <w:t>Frase portadora</w:t>
+            </w:r>
+          </w:p>
+        </w:tc>
+        <w:tc>
+          <w:tcPr>
+            <w:tcW w:type="dxa" w:w="7257"/>
+          </w:tcPr>
+          <w:p>
+            <w:r>
+              <w:rPr>
+                <w:sz w:val="19"/>
+              </w:rPr>
+              <w:t>Frase natural en la que se incrusta la palabra objetivo (“El oso encontró una rana…”) para practicarla con entonación real en vez de aislada.</w:t>
+            </w:r>
+          </w:p>
+        </w:tc>
+      </w:tr>
+      <w:tr>
+        <w:tc>
+          <w:tcPr>
+            <w:tcW w:type="dxa" w:w="2381"/>
+          </w:tcPr>
+          <w:p>
+            <w:r>
+              <w:rPr>
+                <w:sz w:val="19"/>
+              </w:rPr>
+              <w:t>Caos comunicativo</w:t>
+            </w:r>
+          </w:p>
+        </w:tc>
+        <w:tc>
+          <w:tcPr>
+            <w:tcW w:type="dxa" w:w="7257"/>
+          </w:tcPr>
+          <w:p>
+            <w:r>
+              <w:rPr>
+                <w:sz w:val="19"/>
+              </w:rPr>
+              <w:t>Conjunto de retos de carga que el adulto activa a mano en su panel: ruido de fondo, distractor visual y quiebre de la comunicación. Nunca los activa la app sola.</w:t>
+            </w:r>
+          </w:p>
+        </w:tc>
+      </w:tr>
+      <w:tr>
+        <w:tc>
+          <w:tcPr>
+            <w:tcW w:type="dxa" w:w="2381"/>
+          </w:tcPr>
+          <w:p>
+            <w:r>
+              <w:rPr>
+                <w:sz w:val="19"/>
+              </w:rPr>
+              <w:t>Quiebre pragmático</w:t>
+            </w:r>
+          </w:p>
+        </w:tc>
+        <w:tc>
+          <w:tcPr>
+            <w:tcW w:type="dxa" w:w="7257"/>
+          </w:tcPr>
+          <w:p>
+            <w:r>
+              <w:rPr>
+                <w:sz w:val="19"/>
+              </w:rPr>
+              <w:t>Tarea en la que el adulto rompe la comunicación a propósito (murmura o pide algo absurdo) para observar cómo el niño la repara.</w:t>
+            </w:r>
+          </w:p>
+        </w:tc>
+      </w:tr>
     </w:tbl>
     <w:p>
       <w:pPr>
@@ -9363,6 +9779,1210 @@
         <w:br w:type="page"/>
       </w:r>
     </w:p>
+    <w:tbl>
+      <w:tblPr>
+        <w:tblW w:type="auto" w:w="0"/>
+        <w:jc w:val="center"/>
+        <w:tblLook w:firstColumn="1" w:firstRow="1" w:lastColumn="0" w:lastRow="0" w:noHBand="0" w:noVBand="1" w:val="04A0"/>
+      </w:tblPr>
+      <w:tblGrid>
+        <w:gridCol w:w="9638"/>
+      </w:tblGrid>
+      <w:tr>
+        <w:tc>
+          <w:tcPr>
+            <w:tcW w:type="dxa" w:w="9638"/>
+            <w:shd w:val="clear" w:fill="00C4BE"/>
+          </w:tcPr>
+          <w:p>
+            <w:pPr>
+              <w:spacing w:before="80"/>
+            </w:pPr>
+            <w:r>
+              <w:rPr>
+                <w:b/>
+                <w:color w:val="F0FDF9"/>
+                <w:sz w:val="17"/>
+              </w:rPr>
+              <w:t>CU-14 · Profesional / Familia</w:t>
+            </w:r>
+          </w:p>
+          <w:p>
+            <w:pPr>
+              <w:spacing w:after="80"/>
+            </w:pPr>
+            <w:r>
+              <w:rPr>
+                <w:b/>
+                <w:color w:val="FFFFFF"/>
+                <w:sz w:val="28"/>
+              </w:rPr>
+              <w:t>Elegir la variedad de terapia (Castellano · Galego · Dominicano)</w:t>
+            </w:r>
+          </w:p>
+        </w:tc>
+      </w:tr>
+    </w:tbl>
+    <w:tbl>
+      <w:tblPr>
+        <w:tblW w:type="auto" w:w="0"/>
+        <w:jc w:val="center"/>
+        <w:tblLook w:firstColumn="1" w:firstRow="1" w:lastColumn="0" w:lastRow="0" w:noHBand="0" w:noVBand="1" w:val="04A0"/>
+      </w:tblPr>
+      <w:tblGrid>
+        <w:gridCol w:w="4819"/>
+        <w:gridCol w:w="4819"/>
+      </w:tblGrid>
+      <w:tr>
+        <w:tc>
+          <w:tcPr>
+            <w:tcW w:type="dxa" w:w="4819"/>
+          </w:tcPr>
+          <w:p>
+            <w:r>
+              <w:rPr>
+                <w:b/>
+                <w:color w:val="6B7280"/>
+                <w:sz w:val="15"/>
+              </w:rPr>
+              <w:t>ACTOR</w:t>
+            </w:r>
+          </w:p>
+          <w:p>
+            <w:r>
+              <w:rPr>
+                <w:b/>
+                <w:sz w:val="19"/>
+              </w:rPr>
+              <w:t>Logopeda o tutor</w:t>
+            </w:r>
+          </w:p>
+        </w:tc>
+        <w:tc>
+          <w:tcPr>
+            <w:tcW w:type="dxa" w:w="4819"/>
+          </w:tcPr>
+          <w:p>
+            <w:r>
+              <w:rPr>
+                <w:b/>
+                <w:color w:val="6B7280"/>
+                <w:sz w:val="15"/>
+              </w:rPr>
+              <w:t>PANTALLA</w:t>
+            </w:r>
+          </w:p>
+          <w:p>
+            <w:r>
+              <w:rPr>
+                <w:b/>
+                <w:sz w:val="19"/>
+              </w:rPr>
+              <w:t>Tarjeta “Voz de la app”</w:t>
+            </w:r>
+          </w:p>
+        </w:tc>
+      </w:tr>
+      <w:tr>
+        <w:tc>
+          <w:tcPr>
+            <w:tcW w:type="dxa" w:w="4819"/>
+          </w:tcPr>
+          <w:p>
+            <w:r>
+              <w:rPr>
+                <w:b/>
+                <w:color w:val="6B7280"/>
+                <w:sz w:val="15"/>
+              </w:rPr>
+              <w:t>PRECONDICIÓN</w:t>
+            </w:r>
+          </w:p>
+          <w:p>
+            <w:r>
+              <w:rPr>
+                <w:b/>
+                <w:sz w:val="19"/>
+              </w:rPr>
+              <w:t>App abierta (funciona sin conexión)</w:t>
+            </w:r>
+          </w:p>
+        </w:tc>
+        <w:tc>
+          <w:tcPr>
+            <w:tcW w:type="dxa" w:w="4819"/>
+          </w:tcPr>
+          <w:p>
+            <w:r>
+              <w:rPr>
+                <w:b/>
+                <w:color w:val="6B7280"/>
+                <w:sz w:val="15"/>
+              </w:rPr>
+              <w:t>RESULTADO</w:t>
+            </w:r>
+          </w:p>
+          <w:p>
+            <w:r>
+              <w:rPr>
+                <w:b/>
+                <w:sz w:val="19"/>
+              </w:rPr>
+              <w:t>El contenido se locuta y evalúa en la variedad elegida</w:t>
+            </w:r>
+          </w:p>
+        </w:tc>
+      </w:tr>
+    </w:tbl>
+    <w:p>
+      <w:pPr>
+        <w:spacing w:after="40"/>
+      </w:pPr>
+    </w:p>
+    <w:p>
+      <w:r>
+        <w:rPr>
+          <w:b w:val="0"/>
+        </w:rPr>
+        <w:t xml:space="preserve">Valeria+ puede trabajar el contenido terapéutico en </w:t>
+      </w:r>
+      <w:r>
+        <w:rPr>
+          <w:b/>
+        </w:rPr>
+        <w:t>tres variedades</w:t>
+      </w:r>
+      <w:r>
+        <w:rPr>
+          <w:b w:val="0"/>
+        </w:rPr>
+        <w:t xml:space="preserve">. La </w:t>
+      </w:r>
+      <w:r>
+        <w:rPr>
+          <w:b/>
+        </w:rPr>
+        <w:t>interfaz</w:t>
+      </w:r>
+      <w:r>
+        <w:rPr>
+          <w:b w:val="0"/>
+        </w:rPr>
+        <w:t xml:space="preserve"> (menús y botones) sigue en castellano; lo que cambia es </w:t>
+      </w:r>
+      <w:r>
+        <w:rPr>
+          <w:b/>
+        </w:rPr>
+        <w:t>lo que se dice, se muestra y se evalúa</w:t>
+      </w:r>
+      <w:r>
+        <w:rPr>
+          <w:b w:val="0"/>
+        </w:rPr>
+        <w:t>. La elección se guarda en el dispositivo y se aplica a todos los bloques.</w:t>
+      </w:r>
+    </w:p>
+    <w:tbl>
+      <w:tblPr>
+        <w:tblStyle w:val="TableGrid"/>
+        <w:tblW w:type="auto" w:w="0"/>
+        <w:jc w:val="center"/>
+        <w:tblLook w:firstColumn="1" w:firstRow="1" w:lastColumn="0" w:lastRow="0" w:noHBand="0" w:noVBand="1" w:val="04A0"/>
+      </w:tblPr>
+      <w:tblGrid>
+        <w:gridCol w:w="4819"/>
+        <w:gridCol w:w="4819"/>
+      </w:tblGrid>
+      <w:tr>
+        <w:tc>
+          <w:tcPr>
+            <w:tcW w:type="dxa" w:w="2721"/>
+            <w:shd w:val="clear" w:fill="E6F9F8"/>
+          </w:tcPr>
+          <w:p>
+            <w:r>
+              <w:rPr>
+                <w:b/>
+                <w:color w:val="00A39E"/>
+                <w:sz w:val="18"/>
+              </w:rPr>
+              <w:t>Variedad</w:t>
+            </w:r>
+          </w:p>
+        </w:tc>
+        <w:tc>
+          <w:tcPr>
+            <w:tcW w:type="dxa" w:w="6917"/>
+            <w:shd w:val="clear" w:fill="E6F9F8"/>
+          </w:tcPr>
+          <w:p>
+            <w:r>
+              <w:rPr>
+                <w:b/>
+                <w:color w:val="00A39E"/>
+                <w:sz w:val="18"/>
+              </w:rPr>
+              <w:t>Cómo suena y evalúa</w:t>
+            </w:r>
+          </w:p>
+        </w:tc>
+      </w:tr>
+      <w:tr>
+        <w:tc>
+          <w:tcPr>
+            <w:tcW w:type="dxa" w:w="2721"/>
+          </w:tcPr>
+          <w:p>
+            <w:r>
+              <w:rPr>
+                <w:b/>
+                <w:sz w:val="19"/>
+              </w:rPr>
+              <w:t>🇪🇸 Castellano</w:t>
+            </w:r>
+          </w:p>
+        </w:tc>
+        <w:tc>
+          <w:tcPr>
+            <w:tcW w:type="dxa" w:w="6917"/>
+          </w:tcPr>
+          <w:p>
+            <w:r>
+              <w:rPr>
+                <w:sz w:val="19"/>
+              </w:rPr>
+              <w:t>Voz neuronal Sharvard pregenerada (offline) y reconocimiento del sistema en español de España.</w:t>
+            </w:r>
+          </w:p>
+        </w:tc>
+      </w:tr>
+      <w:tr>
+        <w:tc>
+          <w:tcPr>
+            <w:tcW w:type="dxa" w:w="2721"/>
+          </w:tcPr>
+          <w:p>
+            <w:r>
+              <w:rPr>
+                <w:b/>
+                <w:sz w:val="19"/>
+              </w:rPr>
+              <w:t>Galego</w:t>
+            </w:r>
+            <w:r>
+              <w:rPr>
+                <w:b w:val="0"/>
+                <w:sz w:val="19"/>
+              </w:rPr>
+              <w:t xml:space="preserve"> (Proxecto Nós)</w:t>
+            </w:r>
+          </w:p>
+        </w:tc>
+        <w:tc>
+          <w:tcPr>
+            <w:tcW w:type="dxa" w:w="6917"/>
+          </w:tcPr>
+          <w:p>
+            <w:r>
+              <w:rPr>
+                <w:sz w:val="19"/>
+              </w:rPr>
+              <w:t>Voz neuronal Celtia pregenerada en gallego; contenido y pares propios.</w:t>
+            </w:r>
+          </w:p>
+        </w:tc>
+      </w:tr>
+      <w:tr>
+        <w:tc>
+          <w:tcPr>
+            <w:tcW w:type="dxa" w:w="2721"/>
+          </w:tcPr>
+          <w:p>
+            <w:r>
+              <w:rPr>
+                <w:b/>
+                <w:sz w:val="19"/>
+              </w:rPr>
+              <w:t>🇩🇴 Dominicano</w:t>
+            </w:r>
+            <w:r>
+              <w:rPr>
+                <w:b w:val="0"/>
+                <w:sz w:val="19"/>
+              </w:rPr>
+              <w:t xml:space="preserve"> (Quisqueya Habla)</w:t>
+            </w:r>
+          </w:p>
+        </w:tc>
+        <w:tc>
+          <w:tcPr>
+            <w:tcW w:type="dxa" w:w="6917"/>
+          </w:tcPr>
+          <w:p>
+            <w:r>
+              <w:rPr>
+                <w:sz w:val="19"/>
+              </w:rPr>
+              <w:t>Usa la voz latina del dispositivo y el micrófono en es-DO; respeta los rasgos del habla caribeña.</w:t>
+            </w:r>
+          </w:p>
+        </w:tc>
+      </w:tr>
+    </w:tbl>
+    <w:p>
+      <w:pPr>
+        <w:spacing w:after="40"/>
+      </w:pPr>
+    </w:p>
+    <w:p>
+      <w:pPr>
+        <w:keepNext/>
+        <w:spacing w:after="60" w:before="160"/>
+      </w:pPr>
+      <w:r>
+        <w:rPr>
+          <w:b/>
+          <w:i w:val="0"/>
+          <w:color w:val="4B5563"/>
+          <w:sz w:val="21"/>
+        </w:rPr>
+        <w:t>Flujo principal</w:t>
+      </w:r>
+    </w:p>
+    <w:p>
+      <w:pPr>
+        <w:spacing w:after="60"/>
+        <w:ind w:left="454" w:hanging="255"/>
+      </w:pPr>
+      <w:r>
+        <w:rPr>
+          <w:b/>
+        </w:rPr>
+        <w:t xml:space="preserve">1. </w:t>
+      </w:r>
+      <w:r>
+        <w:rPr>
+          <w:b w:val="0"/>
+        </w:rPr>
+        <w:t xml:space="preserve">Abrir la tarjeta </w:t>
+      </w:r>
+      <w:r>
+        <w:rPr>
+          <w:b/>
+        </w:rPr>
+        <w:t>“Voz de la app”</w:t>
+      </w:r>
+      <w:r>
+        <w:rPr>
+          <w:b w:val="0"/>
+        </w:rPr>
+        <w:t xml:space="preserve"> y localizar </w:t>
+      </w:r>
+      <w:r>
+        <w:rPr>
+          <w:b/>
+        </w:rPr>
+        <w:t>“Variedad de la voz”</w:t>
+      </w:r>
+      <w:r>
+        <w:rPr>
+          <w:b w:val="0"/>
+        </w:rPr>
+        <w:t>.</w:t>
+      </w:r>
+    </w:p>
+    <w:p>
+      <w:pPr>
+        <w:spacing w:after="60"/>
+        <w:ind w:left="454" w:hanging="255"/>
+      </w:pPr>
+      <w:r>
+        <w:rPr>
+          <w:b/>
+        </w:rPr>
+        <w:t xml:space="preserve">2. </w:t>
+      </w:r>
+      <w:r>
+        <w:rPr>
+          <w:b w:val="0"/>
+        </w:rPr>
+        <w:t xml:space="preserve">Tocar </w:t>
+      </w:r>
+      <w:r>
+        <w:rPr>
+          <w:b/>
+        </w:rPr>
+        <w:t>Castellano</w:t>
+      </w:r>
+      <w:r>
+        <w:rPr>
+          <w:b w:val="0"/>
+        </w:rPr>
+        <w:t xml:space="preserve">, </w:t>
+      </w:r>
+      <w:r>
+        <w:rPr>
+          <w:b/>
+        </w:rPr>
+        <w:t>Galego</w:t>
+      </w:r>
+      <w:r>
+        <w:rPr>
+          <w:b w:val="0"/>
+        </w:rPr>
+        <w:t xml:space="preserve"> o </w:t>
+      </w:r>
+      <w:r>
+        <w:rPr>
+          <w:b/>
+        </w:rPr>
+        <w:t>Dominicano</w:t>
+      </w:r>
+      <w:r>
+        <w:rPr>
+          <w:b w:val="0"/>
+        </w:rPr>
+        <w:t>.</w:t>
+      </w:r>
+    </w:p>
+    <w:p>
+      <w:pPr>
+        <w:spacing w:after="60"/>
+        <w:ind w:left="454" w:hanging="255"/>
+      </w:pPr>
+      <w:r>
+        <w:rPr>
+          <w:b/>
+        </w:rPr>
+        <w:t xml:space="preserve">3. </w:t>
+      </w:r>
+      <w:r>
+        <w:rPr>
+          <w:b w:val="0"/>
+        </w:rPr>
+        <w:t>La app cambia al instante la locución y el reconocimiento; la tarjeta muestra un aviso sobre la voz disponible.</w:t>
+      </w:r>
+    </w:p>
+    <w:p>
+      <w:pPr>
+        <w:keepNext/>
+        <w:spacing w:after="60" w:before="160"/>
+      </w:pPr>
+      <w:r>
+        <w:rPr>
+          <w:b/>
+          <w:i w:val="0"/>
+          <w:color w:val="4B5563"/>
+          <w:sz w:val="21"/>
+        </w:rPr>
+        <w:t>Flujos alternativos</w:t>
+      </w:r>
+    </w:p>
+    <w:p>
+      <w:pPr>
+        <w:spacing w:after="60"/>
+        <w:ind w:left="454" w:hanging="255"/>
+      </w:pPr>
+      <w:r>
+        <w:t xml:space="preserve">•  </w:t>
+      </w:r>
+      <w:r>
+        <w:rPr>
+          <w:b/>
+        </w:rPr>
+        <w:t>En dominicano suena peninsular o robótica:</w:t>
+      </w:r>
+      <w:r>
+        <w:rPr>
+          <w:b w:val="0"/>
+        </w:rPr>
+        <w:t xml:space="preserve"> instalar una voz de “Español (Latinoamérica)” en los ajustes del dispositivo; la app la usará automáticamente.</w:t>
+      </w:r>
+    </w:p>
+    <w:p>
+      <w:pPr>
+        <w:spacing w:after="60"/>
+        <w:ind w:left="454" w:hanging="255"/>
+      </w:pPr>
+      <w:r>
+        <w:t xml:space="preserve">•  </w:t>
+      </w:r>
+      <w:r>
+        <w:rPr>
+          <w:b/>
+        </w:rPr>
+        <w:t>Falta la voz pregenerada de una locución:</w:t>
+      </w:r>
+      <w:r>
+        <w:rPr>
+          <w:b w:val="0"/>
+        </w:rPr>
+        <w:t xml:space="preserve"> la app recae con suavidad en la voz del sistema, sin interrumpir la sesión.</w:t>
+      </w:r>
+    </w:p>
+    <w:tbl>
+      <w:tblPr>
+        <w:tblW w:type="auto" w:w="0"/>
+        <w:jc w:val="center"/>
+        <w:tblLook w:firstColumn="1" w:firstRow="1" w:lastColumn="0" w:lastRow="0" w:noHBand="0" w:noVBand="1" w:val="04A0"/>
+      </w:tblPr>
+      <w:tblGrid>
+        <w:gridCol w:w="9638"/>
+      </w:tblGrid>
+      <w:tr>
+        <w:tc>
+          <w:tcPr>
+            <w:tcW w:type="dxa" w:w="9638"/>
+            <w:shd w:val="clear" w:fill="F0FDF9"/>
+          </w:tcPr>
+          <w:p>
+            <w:pPr>
+              <w:spacing w:after="40"/>
+            </w:pPr>
+            <w:r>
+              <w:rPr>
+                <w:b/>
+                <w:color w:val="00A39E"/>
+                <w:sz w:val="17"/>
+              </w:rPr>
+              <w:t>RESPETO DIALECTAL</w:t>
+            </w:r>
+          </w:p>
+          <w:p>
+            <w:pPr>
+              <w:spacing w:after="40"/>
+            </w:pPr>
+            <w:r>
+              <w:rPr>
+                <w:b w:val="0"/>
+                <w:sz w:val="19"/>
+              </w:rPr>
+              <w:t xml:space="preserve">En dominicano, la app </w:t>
+            </w:r>
+            <w:r>
+              <w:rPr>
+                <w:b/>
+                <w:sz w:val="19"/>
+              </w:rPr>
+              <w:t>no marca como error</w:t>
+            </w:r>
+            <w:r>
+              <w:rPr>
+                <w:b w:val="0"/>
+                <w:sz w:val="19"/>
+              </w:rPr>
+              <w:t xml:space="preserve"> el seseo, la aspiración de la “s” ni el cambio de “r/l” a final de sílaba: son rasgos normales del habla, no fallos que corregir.</w:t>
+            </w:r>
+          </w:p>
+        </w:tc>
+      </w:tr>
+    </w:tbl>
+    <w:p>
+      <w:pPr>
+        <w:spacing w:after="40"/>
+      </w:pPr>
+    </w:p>
+    <w:tbl>
+      <w:tblPr>
+        <w:tblW w:type="auto" w:w="0"/>
+        <w:jc w:val="center"/>
+        <w:tblLook w:firstColumn="1" w:firstRow="1" w:lastColumn="0" w:lastRow="0" w:noHBand="0" w:noVBand="1" w:val="04A0"/>
+      </w:tblPr>
+      <w:tblGrid>
+        <w:gridCol w:w="9638"/>
+      </w:tblGrid>
+      <w:tr>
+        <w:tc>
+          <w:tcPr>
+            <w:tcW w:type="dxa" w:w="9638"/>
+            <w:shd w:val="clear" w:fill="7C4FD0"/>
+          </w:tcPr>
+          <w:p>
+            <w:pPr>
+              <w:spacing w:before="80"/>
+            </w:pPr>
+            <w:r>
+              <w:rPr>
+                <w:b/>
+                <w:color w:val="F0FDF9"/>
+                <w:sz w:val="17"/>
+              </w:rPr>
+              <w:t>CU-15 · Profesional</w:t>
+            </w:r>
+          </w:p>
+          <w:p>
+            <w:pPr>
+              <w:spacing w:after="80"/>
+            </w:pPr>
+            <w:r>
+              <w:rPr>
+                <w:b/>
+                <w:color w:val="FFFFFF"/>
+                <w:sz w:val="28"/>
+              </w:rPr>
+              <w:t>Panel del Adulto: caos comunicativo (ruido, doble tarea, quiebre)</w:t>
+            </w:r>
+          </w:p>
+        </w:tc>
+      </w:tr>
+    </w:tbl>
+    <w:tbl>
+      <w:tblPr>
+        <w:tblW w:type="auto" w:w="0"/>
+        <w:jc w:val="center"/>
+        <w:tblLook w:firstColumn="1" w:firstRow="1" w:lastColumn="0" w:lastRow="0" w:noHBand="0" w:noVBand="1" w:val="04A0"/>
+      </w:tblPr>
+      <w:tblGrid>
+        <w:gridCol w:w="4819"/>
+        <w:gridCol w:w="4819"/>
+      </w:tblGrid>
+      <w:tr>
+        <w:tc>
+          <w:tcPr>
+            <w:tcW w:type="dxa" w:w="4819"/>
+          </w:tcPr>
+          <w:p>
+            <w:r>
+              <w:rPr>
+                <w:b/>
+                <w:color w:val="6B7280"/>
+                <w:sz w:val="15"/>
+              </w:rPr>
+              <w:t>ACTOR</w:t>
+            </w:r>
+          </w:p>
+          <w:p>
+            <w:r>
+              <w:rPr>
+                <w:b/>
+                <w:sz w:val="19"/>
+              </w:rPr>
+              <w:t>Adulto que dirige la sesión (logopeda o tutor)</w:t>
+            </w:r>
+          </w:p>
+        </w:tc>
+        <w:tc>
+          <w:tcPr>
+            <w:tcW w:type="dxa" w:w="4819"/>
+          </w:tcPr>
+          <w:p>
+            <w:r>
+              <w:rPr>
+                <w:b/>
+                <w:color w:val="6B7280"/>
+                <w:sz w:val="15"/>
+              </w:rPr>
+              <w:t>PANTALLA</w:t>
+            </w:r>
+          </w:p>
+          <w:p>
+            <w:r>
+              <w:rPr>
+                <w:b/>
+                <w:sz w:val="19"/>
+              </w:rPr>
+              <w:t>Reproductor de Ejercicios → Panel del Adulto</w:t>
+            </w:r>
+          </w:p>
+        </w:tc>
+      </w:tr>
+      <w:tr>
+        <w:tc>
+          <w:tcPr>
+            <w:tcW w:type="dxa" w:w="4819"/>
+          </w:tcPr>
+          <w:p>
+            <w:r>
+              <w:rPr>
+                <w:b/>
+                <w:color w:val="6B7280"/>
+                <w:sz w:val="15"/>
+              </w:rPr>
+              <w:t>PRECONDICIÓN</w:t>
+            </w:r>
+          </w:p>
+          <w:p>
+            <w:r>
+              <w:rPr>
+                <w:b/>
+                <w:sz w:val="19"/>
+              </w:rPr>
+              <w:t>Ejercicio de Audición/Lenguaje en curso</w:t>
+            </w:r>
+          </w:p>
+        </w:tc>
+        <w:tc>
+          <w:tcPr>
+            <w:tcW w:type="dxa" w:w="4819"/>
+          </w:tcPr>
+          <w:p>
+            <w:r>
+              <w:rPr>
+                <w:b/>
+                <w:color w:val="6B7280"/>
+                <w:sz w:val="15"/>
+              </w:rPr>
+              <w:t>RESULTADO</w:t>
+            </w:r>
+          </w:p>
+          <w:p>
+            <w:r>
+              <w:rPr>
+                <w:b/>
+                <w:sz w:val="19"/>
+              </w:rPr>
+              <w:t>Reto de carga aplicado a mano y registrado</w:t>
+            </w:r>
+          </w:p>
+        </w:tc>
+      </w:tr>
+    </w:tbl>
+    <w:p>
+      <w:pPr>
+        <w:spacing w:after="40"/>
+      </w:pPr>
+    </w:p>
+    <w:p>
+      <w:r>
+        <w:rPr>
+          <w:b w:val="0"/>
+        </w:rPr>
+        <w:t xml:space="preserve">Para el </w:t>
+      </w:r>
+      <w:r>
+        <w:rPr>
+          <w:b/>
+        </w:rPr>
+        <w:t>piloto clínico</w:t>
+      </w:r>
+      <w:r>
+        <w:rPr>
+          <w:b w:val="0"/>
+        </w:rPr>
+        <w:t xml:space="preserve">, el </w:t>
+      </w:r>
+      <w:r>
+        <w:rPr>
+          <w:b/>
+        </w:rPr>
+        <w:t>Panel del Adulto</w:t>
+      </w:r>
+      <w:r>
+        <w:rPr>
+          <w:b w:val="0"/>
+        </w:rPr>
+        <w:t xml:space="preserve"> (tarjeta plegable dentro del ejercicio) añade tres módulos de </w:t>
+      </w:r>
+      <w:r>
+        <w:rPr>
+          <w:b/>
+        </w:rPr>
+        <w:t>carga comunicativa</w:t>
+      </w:r>
+      <w:r>
+        <w:rPr>
+          <w:b w:val="0"/>
+        </w:rPr>
+        <w:t xml:space="preserve">. Todos son </w:t>
+      </w:r>
+      <w:r>
+        <w:rPr>
+          <w:b/>
+        </w:rPr>
+        <w:t>manuales</w:t>
+      </w:r>
+      <w:r>
+        <w:rPr>
+          <w:b w:val="0"/>
+        </w:rPr>
+        <w:t>: la app nunca los activa, mide ni ajusta por su cuenta; es el adulto quien decide cuándo y cuánto.</w:t>
+      </w:r>
+    </w:p>
+    <w:tbl>
+      <w:tblPr>
+        <w:tblStyle w:val="TableGrid"/>
+        <w:tblW w:type="auto" w:w="0"/>
+        <w:jc w:val="center"/>
+        <w:tblLook w:firstColumn="1" w:firstRow="1" w:lastColumn="0" w:lastRow="0" w:noHBand="0" w:noVBand="1" w:val="04A0"/>
+      </w:tblPr>
+      <w:tblGrid>
+        <w:gridCol w:w="4819"/>
+        <w:gridCol w:w="4819"/>
+      </w:tblGrid>
+      <w:tr>
+        <w:tc>
+          <w:tcPr>
+            <w:tcW w:type="dxa" w:w="2721"/>
+            <w:shd w:val="clear" w:fill="E6F9F8"/>
+          </w:tcPr>
+          <w:p>
+            <w:r>
+              <w:rPr>
+                <w:b/>
+                <w:color w:val="00A39E"/>
+                <w:sz w:val="18"/>
+              </w:rPr>
+              <w:t>Módulo</w:t>
+            </w:r>
+          </w:p>
+        </w:tc>
+        <w:tc>
+          <w:tcPr>
+            <w:tcW w:type="dxa" w:w="6917"/>
+            <w:shd w:val="clear" w:fill="E6F9F8"/>
+          </w:tcPr>
+          <w:p>
+            <w:r>
+              <w:rPr>
+                <w:b/>
+                <w:color w:val="00A39E"/>
+                <w:sz w:val="18"/>
+              </w:rPr>
+              <w:t>Qué hace</w:t>
+            </w:r>
+          </w:p>
+        </w:tc>
+      </w:tr>
+      <w:tr>
+        <w:tc>
+          <w:tcPr>
+            <w:tcW w:type="dxa" w:w="2721"/>
+          </w:tcPr>
+          <w:p>
+            <w:r>
+              <w:rPr>
+                <w:b/>
+                <w:sz w:val="19"/>
+              </w:rPr>
+              <w:t>🔊 Escucha en ruido</w:t>
+            </w:r>
+          </w:p>
+        </w:tc>
+        <w:tc>
+          <w:tcPr>
+            <w:tcW w:type="dxa" w:w="6917"/>
+          </w:tcPr>
+          <w:p>
+            <w:r>
+              <w:rPr>
+                <w:sz w:val="19"/>
+              </w:rPr>
+              <w:t>Un slider añade ruido de fondo (bullicio de cafetería) por debajo de la instrucción. El volumen sube o baja solo con el dedo del adulto.</w:t>
+            </w:r>
+          </w:p>
+        </w:tc>
+      </w:tr>
+      <w:tr>
+        <w:tc>
+          <w:tcPr>
+            <w:tcW w:type="dxa" w:w="2721"/>
+          </w:tcPr>
+          <w:p>
+            <w:r>
+              <w:rPr>
+                <w:b/>
+                <w:sz w:val="19"/>
+              </w:rPr>
+              <w:t>🐻 Doble tarea</w:t>
+            </w:r>
+          </w:p>
+        </w:tc>
+        <w:tc>
+          <w:tcPr>
+            <w:tcW w:type="dxa" w:w="6917"/>
+          </w:tcPr>
+          <w:p>
+            <w:r>
+              <w:rPr>
+                <w:sz w:val="19"/>
+              </w:rPr>
+              <w:t>Un oso distractor se asoma y se mueve por el borde de la pantalla sin ser tocable: obliga al niño a atender a la voz pese a la interferencia visual.</w:t>
+            </w:r>
+          </w:p>
+        </w:tc>
+      </w:tr>
+      <w:tr>
+        <w:tc>
+          <w:tcPr>
+            <w:tcW w:type="dxa" w:w="2721"/>
+          </w:tcPr>
+          <w:p>
+            <w:r>
+              <w:rPr>
+                <w:b/>
+                <w:sz w:val="19"/>
+              </w:rPr>
+              <w:t>💬 Quiebre pragmático</w:t>
+            </w:r>
+          </w:p>
+        </w:tc>
+        <w:tc>
+          <w:tcPr>
+            <w:tcW w:type="dxa" w:w="6917"/>
+          </w:tcPr>
+          <w:p>
+            <w:r>
+              <w:rPr>
+                <w:sz w:val="19"/>
+              </w:rPr>
+              <w:t>La app calla y el adulto rompe la comunicación a propósito; luego marca la estrategia de reparación que usó el niño.</w:t>
+            </w:r>
+          </w:p>
+        </w:tc>
+      </w:tr>
+    </w:tbl>
+    <w:p>
+      <w:pPr>
+        <w:spacing w:after="40"/>
+      </w:pPr>
+    </w:p>
+    <w:p>
+      <w:pPr>
+        <w:keepNext/>
+        <w:spacing w:after="60" w:before="160"/>
+      </w:pPr>
+      <w:r>
+        <w:rPr>
+          <w:b/>
+          <w:i w:val="0"/>
+          <w:color w:val="4B5563"/>
+          <w:sz w:val="21"/>
+        </w:rPr>
+        <w:t>Flujo principal</w:t>
+      </w:r>
+    </w:p>
+    <w:p>
+      <w:pPr>
+        <w:spacing w:after="60"/>
+        <w:ind w:left="454" w:hanging="255"/>
+      </w:pPr>
+      <w:r>
+        <w:rPr>
+          <w:b/>
+        </w:rPr>
+        <w:t xml:space="preserve">1. </w:t>
+      </w:r>
+      <w:r>
+        <w:rPr>
+          <w:b w:val="0"/>
+        </w:rPr>
+        <w:t xml:space="preserve">Durante el ejercicio, desplegar la tarjeta </w:t>
+      </w:r>
+      <w:r>
+        <w:rPr>
+          <w:b/>
+        </w:rPr>
+        <w:t>“Panel del Adulto”</w:t>
+      </w:r>
+      <w:r>
+        <w:rPr>
+          <w:b w:val="0"/>
+        </w:rPr>
+        <w:t>.</w:t>
+      </w:r>
+    </w:p>
+    <w:p>
+      <w:pPr>
+        <w:spacing w:after="60"/>
+        <w:ind w:left="454" w:hanging="255"/>
+      </w:pPr>
+      <w:r>
+        <w:rPr>
+          <w:b/>
+        </w:rPr>
+        <w:t xml:space="preserve">2. </w:t>
+      </w:r>
+      <w:r>
+        <w:rPr>
+          <w:b w:val="0"/>
+        </w:rPr>
+        <w:t xml:space="preserve">Activar el módulo deseado: mover el </w:t>
+      </w:r>
+      <w:r>
+        <w:rPr>
+          <w:b/>
+        </w:rPr>
+        <w:t>slider de ruido</w:t>
+      </w:r>
+      <w:r>
+        <w:rPr>
+          <w:b w:val="0"/>
+        </w:rPr>
+        <w:t xml:space="preserve">, encender el </w:t>
+      </w:r>
+      <w:r>
+        <w:rPr>
+          <w:b/>
+        </w:rPr>
+        <w:t>oso distractor</w:t>
+      </w:r>
+      <w:r>
+        <w:rPr>
+          <w:b w:val="0"/>
+        </w:rPr>
+        <w:t xml:space="preserve"> o lanzar el </w:t>
+      </w:r>
+      <w:r>
+        <w:rPr>
+          <w:b/>
+        </w:rPr>
+        <w:t>quiebre pragmático</w:t>
+      </w:r>
+      <w:r>
+        <w:rPr>
+          <w:b w:val="0"/>
+        </w:rPr>
+        <w:t>.</w:t>
+      </w:r>
+    </w:p>
+    <w:p>
+      <w:pPr>
+        <w:spacing w:after="60"/>
+        <w:ind w:left="454" w:hanging="255"/>
+      </w:pPr>
+      <w:r>
+        <w:rPr>
+          <w:b/>
+        </w:rPr>
+        <w:t xml:space="preserve">3. </w:t>
+      </w:r>
+      <w:r>
+        <w:rPr>
+          <w:b w:val="0"/>
+        </w:rPr>
+        <w:t xml:space="preserve">Guiar la respuesta del niño y, en el quiebre, seleccionar la </w:t>
+      </w:r>
+      <w:r>
+        <w:rPr>
+          <w:b/>
+        </w:rPr>
+        <w:t>estrategia de reparación</w:t>
+      </w:r>
+      <w:r>
+        <w:rPr>
+          <w:b w:val="0"/>
+        </w:rPr>
+        <w:t xml:space="preserve"> observada.</w:t>
+      </w:r>
+    </w:p>
+    <w:p>
+      <w:pPr>
+        <w:spacing w:after="60"/>
+        <w:ind w:left="454" w:hanging="255"/>
+      </w:pPr>
+      <w:r>
+        <w:rPr>
+          <w:b/>
+        </w:rPr>
+        <w:t xml:space="preserve">4. </w:t>
+      </w:r>
+      <w:r>
+        <w:rPr>
+          <w:b w:val="0"/>
+        </w:rPr>
+        <w:t>Desactivar el módulo cuando convenga; el nivel de reto queda registrado de forma anónima.</w:t>
+      </w:r>
+    </w:p>
+    <w:tbl>
+      <w:tblPr>
+        <w:tblW w:type="auto" w:w="0"/>
+        <w:jc w:val="center"/>
+        <w:tblLook w:firstColumn="1" w:firstRow="1" w:lastColumn="0" w:lastRow="0" w:noHBand="0" w:noVBand="1" w:val="04A0"/>
+      </w:tblPr>
+      <w:tblGrid>
+        <w:gridCol w:w="9638"/>
+      </w:tblGrid>
+      <w:tr>
+        <w:tc>
+          <w:tcPr>
+            <w:tcW w:type="dxa" w:w="9638"/>
+            <w:shd w:val="clear" w:fill="FFFBEB"/>
+          </w:tcPr>
+          <w:p>
+            <w:pPr>
+              <w:spacing w:after="40"/>
+            </w:pPr>
+            <w:r>
+              <w:rPr>
+                <w:b/>
+                <w:color w:val="B45309"/>
+                <w:sz w:val="17"/>
+              </w:rPr>
+              <w:t>ANTES DEL QUIEBRE PRAGMÁTICO</w:t>
+            </w:r>
+          </w:p>
+          <w:p>
+            <w:pPr>
+              <w:spacing w:after="40"/>
+            </w:pPr>
+            <w:r>
+              <w:rPr>
+                <w:sz w:val="19"/>
+              </w:rPr>
+              <w:t>Un aviso recuerda que la tarea genera “frustración útil” y se puede cancelar. Explicarlo evita que la familia lo viva como un fallo de la app.</w:t>
+            </w:r>
+          </w:p>
+        </w:tc>
+      </w:tr>
+    </w:tbl>
+    <w:p>
+      <w:pPr>
+        <w:spacing w:after="40"/>
+      </w:pPr>
+    </w:p>
+    <w:tbl>
+      <w:tblPr>
+        <w:tblW w:type="auto" w:w="0"/>
+        <w:jc w:val="center"/>
+        <w:tblLook w:firstColumn="1" w:firstRow="1" w:lastColumn="0" w:lastRow="0" w:noHBand="0" w:noVBand="1" w:val="04A0"/>
+      </w:tblPr>
+      <w:tblGrid>
+        <w:gridCol w:w="9638"/>
+      </w:tblGrid>
+      <w:tr>
+        <w:tc>
+          <w:tcPr>
+            <w:tcW w:type="dxa" w:w="9638"/>
+            <w:shd w:val="clear" w:fill="F5F0FF"/>
+          </w:tcPr>
+          <w:p>
+            <w:pPr>
+              <w:spacing w:after="40"/>
+            </w:pPr>
+            <w:r>
+              <w:rPr>
+                <w:b/>
+                <w:color w:val="6D3FC4"/>
+                <w:sz w:val="17"/>
+              </w:rPr>
+              <w:t>SIEMPRE EN MANOS DEL ADULTO</w:t>
+            </w:r>
+          </w:p>
+          <w:p>
+            <w:pPr>
+              <w:spacing w:after="40"/>
+            </w:pPr>
+            <w:r>
+              <w:rPr>
+                <w:sz w:val="19"/>
+              </w:rPr>
+              <w:t>Ningún módulo se activa solo. Esta regla es deliberada: mantiene la app como herramienta de apoyo a la terapia, no como un aparato de medición automática.</w:t>
+            </w:r>
+          </w:p>
+        </w:tc>
+      </w:tr>
+    </w:tbl>
+    <w:p>
+      <w:pPr>
+        <w:spacing w:after="40"/>
+      </w:pPr>
+    </w:p>
+    <w:p>
+      <w:r>
+        <w:br w:type="page"/>
+      </w:r>
+    </w:p>
     <w:p>
       <w:pPr>
         <w:keepNext/>
@@ -9795,6 +11415,118 @@
           </w:p>
         </w:tc>
       </w:tr>
+      <w:tr>
+        <w:tc>
+          <w:tcPr>
+            <w:tcW w:type="dxa" w:w="3402"/>
+          </w:tcPr>
+          <w:p>
+            <w:r>
+              <w:rPr>
+                <w:sz w:val="19"/>
+              </w:rPr>
+              <w:t>¿Puedo usar la app en gallego o en dominicano?</w:t>
+            </w:r>
+          </w:p>
+        </w:tc>
+        <w:tc>
+          <w:tcPr>
+            <w:tcW w:type="dxa" w:w="6236"/>
+          </w:tcPr>
+          <w:p>
+            <w:r>
+              <w:rPr>
+                <w:sz w:val="19"/>
+              </w:rPr>
+              <w:t>Sí. En la tarjeta “Voz de la app” se elige la variedad (Castellano, Galego o Dominicano). Cambia lo que se locuta y evalúa; los menús siguen en castellano (CU-14).</w:t>
+            </w:r>
+          </w:p>
+        </w:tc>
+      </w:tr>
+      <w:tr>
+        <w:tc>
+          <w:tcPr>
+            <w:tcW w:type="dxa" w:w="3402"/>
+          </w:tcPr>
+          <w:p>
+            <w:r>
+              <w:rPr>
+                <w:sz w:val="19"/>
+              </w:rPr>
+              <w:t>En dominicano la voz suena de España o robótica</w:t>
+            </w:r>
+          </w:p>
+        </w:tc>
+        <w:tc>
+          <w:tcPr>
+            <w:tcW w:type="dxa" w:w="6236"/>
+          </w:tcPr>
+          <w:p>
+            <w:r>
+              <w:rPr>
+                <w:sz w:val="19"/>
+              </w:rPr>
+              <w:t>Instale una voz de “Español (Latinoamérica)” en los ajustes del dispositivo. La app la detecta y la usa automáticamente (v8).</w:t>
+            </w:r>
+          </w:p>
+        </w:tc>
+      </w:tr>
+      <w:tr>
+        <w:tc>
+          <w:tcPr>
+            <w:tcW w:type="dxa" w:w="3402"/>
+          </w:tcPr>
+          <w:p>
+            <w:r>
+              <w:rPr>
+                <w:sz w:val="19"/>
+              </w:rPr>
+              <w:t>Marca como error algo que en mi país se dice así</w:t>
+            </w:r>
+          </w:p>
+        </w:tc>
+        <w:tc>
+          <w:tcPr>
+            <w:tcW w:type="dxa" w:w="6236"/>
+          </w:tcPr>
+          <w:p>
+            <w:r>
+              <w:rPr>
+                <w:sz w:val="19"/>
+              </w:rPr>
+              <w:t>En la variedad dominicana la app respeta los rasgos del habla caribeña (seseo, “s” aspirada, “r/l” final). Y recuerde: el adulto es siempre el juez final del veredicto.</w:t>
+            </w:r>
+          </w:p>
+        </w:tc>
+      </w:tr>
+      <w:tr>
+        <w:tc>
+          <w:tcPr>
+            <w:tcW w:type="dxa" w:w="3402"/>
+          </w:tcPr>
+          <w:p>
+            <w:r>
+              <w:rPr>
+                <w:sz w:val="19"/>
+              </w:rPr>
+              <w:t>Apareció ruido de fondo o un oso moviéndose</w:t>
+            </w:r>
+          </w:p>
+        </w:tc>
+        <w:tc>
+          <w:tcPr>
+            <w:tcW w:type="dxa" w:w="6236"/>
+          </w:tcPr>
+          <w:p>
+            <w:r>
+              <w:rPr>
+                <w:sz w:val="19"/>
+              </w:rPr>
+              <w:t>Son módulos del Panel del Adulto (caos comunicativo) del piloto; solo se activan a mano. Desactívelos desde ese mismo panel (CU-15).</w:t>
+            </w:r>
+          </w:p>
+        </w:tc>
+      </w:tr>
     </w:tbl>
     <w:p>
       <w:pPr>
@@ -9817,7 +11549,7 @@
           <w:color w:val="6B7280"/>
           <w:sz w:val="17"/>
         </w:rPr>
-        <w:t>Valeria+ · Manual de Casos de Uso · v7 (con capturas de pantalla) · Julio de 2026 · Terapia auditivo-verbal y del lenguaje para la infancia. Documento de apoyo para logopedas y familias. Los datos personales se tratan localmente conforme a RGPD/HIPAA; la sincronización en la nube y la telemetría anónima del piloto son opcionales.</w:t>
+        <w:t>Valeria+ · Manual de Casos de Uso · v8 (con capturas de pantalla) · Julio de 2026 · Terapia auditivo-verbal y del lenguaje para la infancia. Documento de apoyo para logopedas y familias. Disponible en Castellano, Galego (Proxecto Nós) y Dominicano (Quisqueya Habla). Los datos personales se tratan localmente conforme a RGPD/HIPAA; la sincronización en la nube y la telemetría anónima del piloto son opcionales.</w:t>
       </w:r>
     </w:p>
     <w:sectPr>
@@ -9843,7 +11575,7 @@
         <w:color w:val="6B7280"/>
         <w:sz w:val="16"/>
       </w:rPr>
-      <w:t>Valeria+ · Manual de Casos de Uso · v7 (con capturas de pantalla) · Julio de 2026</w:t>
+      <w:t>Valeria+ · Manual de Casos de Uso · v8 (con capturas de pantalla) · Julio de 2026</w:t>
     </w:r>
   </w:p>
 </w:ftr>

</xml_diff>

<commit_message>
Renombrar «caos comunicativo» a «carga comunicativa» en README y manual
Sustituye el término en el README y en el manual de casos de uso (HTML,
build-docx.py, DOCX y PDF regenerados): encabezados, índice, glosario,
CU-15 y FAQ. El identificador de código del componente no cambia.

Co-Authored-By: Claude Opus 4.8 <noreply@anthropic.com>
Claude-Session: https://claude.ai/code/session_01Fw1f1mscN65yNdJMti3hyG
</commit_message>
<xml_diff>
--- a/docs/Valeria-Manual-Casos-de-Uso.docx
+++ b/docs/Valeria-Manual-Casos-de-Uso.docx
@@ -451,7 +451,7 @@
         <w:t xml:space="preserve">CU-15   </w:t>
       </w:r>
       <w:r>
-        <w:t>Panel del Adulto: caos comunicativo (ruido, doble tarea, quiebre)</w:t>
+        <w:t>Panel del Adulto: carga comunicativa (ruido, doble tarea, quiebre)</w:t>
       </w:r>
     </w:p>
     <w:p>
@@ -1427,7 +1427,7 @@
                 <w:b/>
                 <w:sz w:val="19"/>
               </w:rPr>
-              <w:t>🎛️ Panel del Adulto · Caos Comunicativo</w:t>
+              <w:t>🎛️ Panel del Adulto · Carga Comunicativa</w:t>
             </w:r>
           </w:p>
         </w:tc>
@@ -2847,7 +2847,7 @@
               <w:rPr>
                 <w:sz w:val="19"/>
               </w:rPr>
-              <w:t>Caos comunicativo</w:t>
+              <w:t>Carga comunicativa</w:t>
             </w:r>
           </w:p>
         </w:tc>
@@ -2860,7 +2860,7 @@
               <w:rPr>
                 <w:sz w:val="19"/>
               </w:rPr>
-              <w:t>Conjunto de retos de carga que el adulto activa a mano en su panel: ruido de fondo, distractor visual y quiebre de la comunicación. Nunca los activa la app sola.</w:t>
+              <w:t>Conjunto de retos que el adulto activa a mano en su panel: ruido de fondo, distractor visual y quiebre de la comunicación. Nunca los activa la app sola.</w:t>
             </w:r>
           </w:p>
         </w:tc>
@@ -10421,7 +10421,7 @@
                 <w:color w:val="FFFFFF"/>
                 <w:sz w:val="28"/>
               </w:rPr>
-              <w:t>Panel del Adulto: caos comunicativo (ruido, doble tarea, quiebre)</w:t>
+              <w:t>Panel del Adulto: carga comunicativa (ruido, doble tarea, quiebre)</w:t>
             </w:r>
           </w:p>
         </w:tc>
@@ -11522,7 +11522,7 @@
               <w:rPr>
                 <w:sz w:val="19"/>
               </w:rPr>
-              <w:t>Son módulos del Panel del Adulto (caos comunicativo) del piloto; solo se activan a mano. Desactívelos desde ese mismo panel (CU-15).</w:t>
+              <w:t>Son módulos del Panel del Adulto (carga comunicativa) del piloto; solo se activan a mano. Desactívelos desde ese mismo panel (CU-15).</w:t>
             </w:r>
           </w:p>
         </w:tc>

</xml_diff>

<commit_message>
Ilustrar CU-14 y CU-15 con capturas reales (Fig. 22 y 23)
Añade dos capturas nuevas generadas con Expo web + Playwright:
- 22-voz-variedad.png: tarjeta «Voz de la app» con el selector de variedad
  (Castellano · Galego · Dominicano) — CU-14.
- 23-panel-adulto.png: Panel del Adulto desplegado con los tres módulos
  (ruido babble, oso distractor y quiebre pragmático) — CU-15.

Inserta las figuras en el manual (HTML y build-docx.py), añade los dos
bloques de navegación al script capture-screenshots.js para reproducirlas,
y regenera DOCX y PDF (23 figuras). Actualiza el conteo en el README.

Co-Authored-By: Claude Opus 4.8 <noreply@anthropic.com>
Claude-Session: https://claude.ai/code/session_01Fw1f1mscN65yNdJMti3hyG
</commit_message>
<xml_diff>
--- a/docs/Valeria-Manual-Casos-de-Uso.docx
+++ b/docs/Valeria-Manual-Casos-de-Uso.docx
@@ -10396,6 +10396,94 @@
         <w:tc>
           <w:tcPr>
             <w:tcW w:type="dxa" w:w="9638"/>
+          </w:tcPr>
+          <w:p>
+            <w:pPr>
+              <w:jc w:val="center"/>
+            </w:pPr>
+            <w:r>
+              <w:drawing>
+                <wp:inline xmlns:a="http://schemas.openxmlformats.org/drawingml/2006/main" xmlns:pic="http://schemas.openxmlformats.org/drawingml/2006/picture">
+                  <wp:extent cx="2304000" cy="4986092"/>
+                  <wp:docPr id="22" name="Picture 22"/>
+                  <wp:cNvGraphicFramePr>
+                    <a:graphicFrameLocks noChangeAspect="1"/>
+                  </wp:cNvGraphicFramePr>
+                  <a:graphic>
+                    <a:graphicData uri="http://schemas.openxmlformats.org/drawingml/2006/picture">
+                      <pic:pic>
+                        <pic:nvPicPr>
+                          <pic:cNvPr id="0" name="22-voz-variedad.png"/>
+                          <pic:cNvPicPr/>
+                        </pic:nvPicPr>
+                        <pic:blipFill>
+                          <a:blip r:embed="rId31"/>
+                          <a:stretch>
+                            <a:fillRect/>
+                          </a:stretch>
+                        </pic:blipFill>
+                        <pic:spPr>
+                          <a:xfrm>
+                            <a:off x="0" y="0"/>
+                            <a:ext cx="2304000" cy="4986092"/>
+                          </a:xfrm>
+                          <a:prstGeom prst="rect"/>
+                        </pic:spPr>
+                      </pic:pic>
+                    </a:graphicData>
+                  </a:graphic>
+                </wp:inline>
+              </w:drawing>
+            </w:r>
+          </w:p>
+        </w:tc>
+      </w:tr>
+      <w:tr>
+        <w:tc>
+          <w:tcPr>
+            <w:tcW w:type="dxa" w:w="9638"/>
+          </w:tcPr>
+          <w:p>
+            <w:pPr>
+              <w:jc w:val="center"/>
+            </w:pPr>
+            <w:r>
+              <w:rPr>
+                <w:b/>
+                <w:color w:val="00A39E"/>
+                <w:sz w:val="17"/>
+              </w:rPr>
+              <w:t xml:space="preserve">Fig. 22 · </w:t>
+            </w:r>
+            <w:r>
+              <w:rPr>
+                <w:color w:val="4B5563"/>
+                <w:sz w:val="17"/>
+              </w:rPr>
+              <w:t>Tarjeta “Voz de la app”: selector de variedad Castellano · Galego · Dominicano.</w:t>
+            </w:r>
+          </w:p>
+        </w:tc>
+      </w:tr>
+    </w:tbl>
+    <w:p>
+      <w:pPr>
+        <w:spacing w:after="40"/>
+      </w:pPr>
+    </w:p>
+    <w:tbl>
+      <w:tblPr>
+        <w:tblW w:type="auto" w:w="0"/>
+        <w:jc w:val="center"/>
+        <w:tblLook w:firstColumn="1" w:firstRow="1" w:lastColumn="0" w:lastRow="0" w:noHBand="0" w:noVBand="1" w:val="04A0"/>
+      </w:tblPr>
+      <w:tblGrid>
+        <w:gridCol w:w="9638"/>
+      </w:tblGrid>
+      <w:tr>
+        <w:tc>
+          <w:tcPr>
+            <w:tcW w:type="dxa" w:w="9638"/>
             <w:shd w:val="clear" w:fill="7C4FD0"/>
           </w:tcPr>
           <w:p>
@@ -10968,6 +11056,94 @@
                 <w:sz w:val="19"/>
               </w:rPr>
               <w:t>Ningún módulo se activa solo. Esta regla es deliberada: mantiene la app como herramienta de apoyo a la terapia, no como un aparato de medición automática.</w:t>
+            </w:r>
+          </w:p>
+        </w:tc>
+      </w:tr>
+    </w:tbl>
+    <w:p>
+      <w:pPr>
+        <w:spacing w:after="40"/>
+      </w:pPr>
+    </w:p>
+    <w:tbl>
+      <w:tblPr>
+        <w:tblW w:type="auto" w:w="0"/>
+        <w:jc w:val="center"/>
+        <w:tblLook w:firstColumn="1" w:firstRow="1" w:lastColumn="0" w:lastRow="0" w:noHBand="0" w:noVBand="1" w:val="04A0"/>
+      </w:tblPr>
+      <w:tblGrid>
+        <w:gridCol w:w="9638"/>
+      </w:tblGrid>
+      <w:tr>
+        <w:tc>
+          <w:tcPr>
+            <w:tcW w:type="dxa" w:w="9638"/>
+          </w:tcPr>
+          <w:p>
+            <w:pPr>
+              <w:jc w:val="center"/>
+            </w:pPr>
+            <w:r>
+              <w:drawing>
+                <wp:inline xmlns:a="http://schemas.openxmlformats.org/drawingml/2006/main" xmlns:pic="http://schemas.openxmlformats.org/drawingml/2006/picture">
+                  <wp:extent cx="2304000" cy="4986092"/>
+                  <wp:docPr id="23" name="Picture 23"/>
+                  <wp:cNvGraphicFramePr>
+                    <a:graphicFrameLocks noChangeAspect="1"/>
+                  </wp:cNvGraphicFramePr>
+                  <a:graphic>
+                    <a:graphicData uri="http://schemas.openxmlformats.org/drawingml/2006/picture">
+                      <pic:pic>
+                        <pic:nvPicPr>
+                          <pic:cNvPr id="0" name="23-panel-adulto.png"/>
+                          <pic:cNvPicPr/>
+                        </pic:nvPicPr>
+                        <pic:blipFill>
+                          <a:blip r:embed="rId32"/>
+                          <a:stretch>
+                            <a:fillRect/>
+                          </a:stretch>
+                        </pic:blipFill>
+                        <pic:spPr>
+                          <a:xfrm>
+                            <a:off x="0" y="0"/>
+                            <a:ext cx="2304000" cy="4986092"/>
+                          </a:xfrm>
+                          <a:prstGeom prst="rect"/>
+                        </pic:spPr>
+                      </pic:pic>
+                    </a:graphicData>
+                  </a:graphic>
+                </wp:inline>
+              </w:drawing>
+            </w:r>
+          </w:p>
+        </w:tc>
+      </w:tr>
+      <w:tr>
+        <w:tc>
+          <w:tcPr>
+            <w:tcW w:type="dxa" w:w="9638"/>
+          </w:tcPr>
+          <w:p>
+            <w:pPr>
+              <w:jc w:val="center"/>
+            </w:pPr>
+            <w:r>
+              <w:rPr>
+                <w:b/>
+                <w:color w:val="00A39E"/>
+                <w:sz w:val="17"/>
+              </w:rPr>
+              <w:t xml:space="preserve">Fig. 23 · </w:t>
+            </w:r>
+            <w:r>
+              <w:rPr>
+                <w:color w:val="4B5563"/>
+                <w:sz w:val="17"/>
+              </w:rPr>
+              <w:t>Panel del Adulto desplegado: ruido de fondo, oso distractor y quiebre pragmático.</w:t>
             </w:r>
           </w:p>
         </w:tc>

</xml_diff>

<commit_message>
Actualiza README y manual de casos de uso a la v8.1
- README: fila del galego con el retroceso al asset castellano, banco de voz
  al dato real (1174 locuciones, versión 2026-07-19) y nueva entrada V8.1 en
  el historial con los tres arreglos (botón de reingreso, paciente real en
  resultados/Ling y voz gallega).
- Manual (HTML + build-docx.py, espejados): portada y pie a v8.1, sección
  «Novedades de la versión 8.1», CU-06/CU-07/CU-11/CU-14 actualizados y nueva
  entrada de FAQ sobre la voz gallega.
- Capturas regeneradas (23) con la app arreglada: Bienvenida muestra el botón
  completo y Resultados/Ling la ficha del paciente activo. El script de
  capturas acepta CHROMIUM_PATH para reutilizar un Chromium ya instalado y
  actualiza el rótulo del paso de evaluación al texto actual del player.
- DOCX y PDF regenerados desde las fuentes actualizadas.

Co-Authored-By: Claude Fable 5 <noreply@anthropic.com>
Claude-Session: https://claude.ai/code/session_01Fa2UuCssXUMKx9fnffvRu2
</commit_message>
<xml_diff>
--- a/docs/Valeria-Manual-Casos-de-Uso.docx
+++ b/docs/Valeria-Manual-Casos-de-Uso.docx
@@ -61,7 +61,7 @@
           <w:color w:val="00A39E"/>
           <w:sz w:val="20"/>
         </w:rPr>
-        <w:t>Manual de usuario · v8 · con capturas de pantalla</w:t>
+        <w:t>Manual de usuario · v8.1 · con capturas de pantalla</w:t>
       </w:r>
     </w:p>
     <w:p>
@@ -1470,6 +1470,164 @@
                 <w:sz w:val="19"/>
               </w:rPr>
               <w:t>En Pares Mínimos la palabra objetivo ya no se dicta aislada: se incrusta en una frase con entonación natural seguida de una pregunta, sin repetirse en diez ensayos seguidos.</w:t>
+            </w:r>
+          </w:p>
+        </w:tc>
+      </w:tr>
+    </w:tbl>
+    <w:p>
+      <w:pPr>
+        <w:spacing w:after="40"/>
+      </w:pPr>
+    </w:p>
+    <w:p>
+      <w:pPr>
+        <w:pStyle w:val="Heading3"/>
+      </w:pPr>
+      <w:r>
+        <w:t>Novedades de la versión 8.1</w:t>
+      </w:r>
+    </w:p>
+    <w:p>
+      <w:pPr>
+        <w:spacing w:after="120"/>
+      </w:pPr>
+      <w:r>
+        <w:rPr>
+          <w:b w:val="0"/>
+          <w:i w:val="0"/>
+        </w:rPr>
+        <w:t>La versión 8.1 pule tres puntos detectados en el uso real tras el registro del paciente:</w:t>
+      </w:r>
+    </w:p>
+    <w:tbl>
+      <w:tblPr>
+        <w:tblStyle w:val="TableGrid"/>
+        <w:tblW w:type="auto" w:w="0"/>
+        <w:jc w:val="center"/>
+        <w:tblLook w:firstColumn="1" w:firstRow="1" w:lastColumn="0" w:lastRow="0" w:noHBand="0" w:noVBand="1" w:val="04A0"/>
+      </w:tblPr>
+      <w:tblGrid>
+        <w:gridCol w:w="4819"/>
+        <w:gridCol w:w="4819"/>
+      </w:tblGrid>
+      <w:tr>
+        <w:tc>
+          <w:tcPr>
+            <w:tcW w:type="dxa" w:w="2721"/>
+            <w:shd w:val="clear" w:fill="E6F9F8"/>
+          </w:tcPr>
+          <w:p>
+            <w:r>
+              <w:rPr>
+                <w:b/>
+                <w:color w:val="00A39E"/>
+                <w:sz w:val="18"/>
+              </w:rPr>
+              <w:t>Mejora</w:t>
+            </w:r>
+          </w:p>
+        </w:tc>
+        <w:tc>
+          <w:tcPr>
+            <w:tcW w:type="dxa" w:w="6917"/>
+            <w:shd w:val="clear" w:fill="E6F9F8"/>
+          </w:tcPr>
+          <w:p>
+            <w:r>
+              <w:rPr>
+                <w:b/>
+                <w:color w:val="00A39E"/>
+                <w:sz w:val="18"/>
+              </w:rPr>
+              <w:t>Qué cambia</w:t>
+            </w:r>
+          </w:p>
+        </w:tc>
+      </w:tr>
+      <w:tr>
+        <w:tc>
+          <w:tcPr>
+            <w:tcW w:type="dxa" w:w="2721"/>
+          </w:tcPr>
+          <w:p>
+            <w:r>
+              <w:rPr>
+                <w:b/>
+                <w:sz w:val="19"/>
+              </w:rPr>
+              <w:t>🔘 Botón de reingreso más visible</w:t>
+            </w:r>
+          </w:p>
+        </w:tc>
+        <w:tc>
+          <w:tcPr>
+            <w:tcW w:type="dxa" w:w="6917"/>
+          </w:tcPr>
+          <w:p>
+            <w:r>
+              <w:rPr>
+                <w:sz w:val="19"/>
+              </w:rPr>
+              <w:t>En Bienvenida, “Ya tengo un paciente registrado” deja de ser un enlace pequeño y pasa a ser un botón de tamaño completo, al nivel de “Comenzar” (ver CU-06).</w:t>
+            </w:r>
+          </w:p>
+        </w:tc>
+      </w:tr>
+      <w:tr>
+        <w:tc>
+          <w:tcPr>
+            <w:tcW w:type="dxa" w:w="2721"/>
+          </w:tcPr>
+          <w:p>
+            <w:r>
+              <w:rPr>
+                <w:b/>
+                <w:sz w:val="19"/>
+              </w:rPr>
+              <w:t>🪪 Resultados con el paciente real</w:t>
+            </w:r>
+          </w:p>
+        </w:tc>
+        <w:tc>
+          <w:tcPr>
+            <w:tcW w:type="dxa" w:w="6917"/>
+          </w:tcPr>
+          <w:p>
+            <w:r>
+              <w:rPr>
+                <w:sz w:val="19"/>
+              </w:rPr>
+              <w:t>La cabecera del panel de resultados y del Test de Ling, y el informe que se comparte, muestran ahora el nombre y NHC de la ficha registrada (antes aparecía un dato de muestra fijo). Si no hay ficha, se indica con un rótulo neutro (ver CU-07 y CU-11).</w:t>
+            </w:r>
+          </w:p>
+        </w:tc>
+      </w:tr>
+      <w:tr>
+        <w:tc>
+          <w:tcPr>
+            <w:tcW w:type="dxa" w:w="2721"/>
+          </w:tcPr>
+          <w:p>
+            <w:r>
+              <w:rPr>
+                <w:b/>
+                <w:sz w:val="19"/>
+              </w:rPr>
+              <w:t>🔊 La voz gallega siempre arranca</w:t>
+            </w:r>
+          </w:p>
+        </w:tc>
+        <w:tc>
+          <w:tcPr>
+            <w:tcW w:type="dxa" w:w="6917"/>
+          </w:tcPr>
+          <w:p>
+            <w:r>
+              <w:rPr>
+                <w:sz w:val="19"/>
+              </w:rPr>
+              <w:t>En galego, la Expansión Semántica y los ejercicios de Audición y Lenguaje (contenido compartido con el castellano) suenan con la voz neuronal castellana mientras Celtia no los cubra, en vez de quedar en silencio en dispositivos sin voz gallega (ver CU-14).</w:t>
             </w:r>
           </w:p>
         </w:tc>
@@ -6207,19 +6365,19 @@
         <w:rPr>
           <w:b w:val="0"/>
         </w:rPr>
-        <w:t xml:space="preserve">, pulsar </w:t>
+        <w:t xml:space="preserve">, pulsar el botón </w:t>
       </w:r>
       <w:r>
         <w:rPr>
           <w:b/>
         </w:rPr>
-        <w:t>“Ya tengo un paciente”</w:t>
+        <w:t>“Ya tengo un paciente registrado”</w:t>
       </w:r>
       <w:r>
         <w:rPr>
           <w:b w:val="0"/>
         </w:rPr>
-        <w:t>.</w:t>
+        <w:t xml:space="preserve"> (desde la v8.1, un botón de tamaño completo bajo “Comenzar”).</w:t>
       </w:r>
     </w:p>
     <w:p>
@@ -6605,7 +6763,19 @@
         <w:rPr>
           <w:b w:val="0"/>
         </w:rPr>
-        <w:t xml:space="preserve"> Si es No, se salta a los ejercicios.</w:t>
+        <w:t xml:space="preserve"> Si es No, se salta a los ejercicios. La cabecera muestra el </w:t>
+      </w:r>
+      <w:r>
+        <w:rPr>
+          <w:b/>
+        </w:rPr>
+        <w:t>nombre del paciente activo</w:t>
+      </w:r>
+      <w:r>
+        <w:rPr>
+          <w:b w:val="0"/>
+        </w:rPr>
+        <w:t xml:space="preserve"> tomado de su ficha (v8.1).</w:t>
       </w:r>
     </w:p>
     <w:p>
@@ -8424,7 +8594,19 @@
         <w:rPr>
           <w:b w:val="0"/>
         </w:rPr>
-        <w:t xml:space="preserve"> al finalizar una sesión o desde la ficha.</w:t>
+        <w:t xml:space="preserve"> al finalizar una sesión o desde la ficha. La cabecera muestra el </w:t>
+      </w:r>
+      <w:r>
+        <w:rPr>
+          <w:b/>
+        </w:rPr>
+        <w:t>nombre y NHC del paciente activo</w:t>
+      </w:r>
+      <w:r>
+        <w:rPr>
+          <w:b w:val="0"/>
+        </w:rPr>
+        <w:t>, tomados de su ficha de registro (v8.1).</w:t>
       </w:r>
     </w:p>
     <w:p>
@@ -10088,7 +10270,7 @@
               <w:rPr>
                 <w:sz w:val="19"/>
               </w:rPr>
-              <w:t>Voz neuronal Celtia pregenerada en gallego; contenido y pares propios.</w:t>
+              <w:t>Voz neuronal Celtia pregenerada en gallego; contenido y pares propios. El contenido compartido con el castellano (Expansión Semántica, Audición y Lenguaje) suena con la voz neuronal castellana mientras Celtia no lo cubra (v8.1).</w:t>
             </w:r>
           </w:p>
         </w:tc>
@@ -10318,7 +10500,7 @@
         <w:rPr>
           <w:b w:val="0"/>
         </w:rPr>
-        <w:t xml:space="preserve"> la app recae con suavidad en la voz del sistema, sin interrumpir la sesión.</w:t>
+        <w:t xml:space="preserve"> en galego se reproduce primero el asset neuronal castellano equivalente si existe (v8.1); en último término, la app recae con suavidad en la voz del sistema, sin interrumpir la sesión.</w:t>
       </w:r>
     </w:p>
     <w:tbl>
@@ -11657,7 +11839,7 @@
               <w:rPr>
                 <w:sz w:val="19"/>
               </w:rPr>
-              <w:t>Marca como error algo que en mi país se dice así</w:t>
+              <w:t>En galego, algunos ejercicios no hablaban</w:t>
             </w:r>
           </w:p>
         </w:tc>
@@ -11670,7 +11852,7 @@
               <w:rPr>
                 <w:sz w:val="19"/>
               </w:rPr>
-              <w:t>En la variedad dominicana la app respeta los rasgos del habla caribeña (seseo, “s” aspirada, “r/l” final). Y recuerde: el adulto es siempre el juez final del veredicto.</w:t>
+              <w:t>Corregido en la v8.1: la Expansión Semántica y los ejercicios de Audición y Lenguaje suenan ahora con la voz neuronal castellana mientras Celtia no cubra ese contenido. Actualice la app si sigue ocurriendo.</w:t>
             </w:r>
           </w:p>
         </w:tc>
@@ -11685,7 +11867,7 @@
               <w:rPr>
                 <w:sz w:val="19"/>
               </w:rPr>
-              <w:t>Apareció ruido de fondo o un oso moviéndose</w:t>
+              <w:t>Marca como error algo que en mi país se dice así</w:t>
             </w:r>
           </w:p>
         </w:tc>
@@ -11698,6 +11880,34 @@
               <w:rPr>
                 <w:sz w:val="19"/>
               </w:rPr>
+              <w:t>En la variedad dominicana la app respeta los rasgos del habla caribeña (seseo, “s” aspirada, “r/l” final). Y recuerde: el adulto es siempre el juez final del veredicto.</w:t>
+            </w:r>
+          </w:p>
+        </w:tc>
+      </w:tr>
+      <w:tr>
+        <w:tc>
+          <w:tcPr>
+            <w:tcW w:type="dxa" w:w="3402"/>
+          </w:tcPr>
+          <w:p>
+            <w:r>
+              <w:rPr>
+                <w:sz w:val="19"/>
+              </w:rPr>
+              <w:t>Apareció ruido de fondo o un oso moviéndose</w:t>
+            </w:r>
+          </w:p>
+        </w:tc>
+        <w:tc>
+          <w:tcPr>
+            <w:tcW w:type="dxa" w:w="6236"/>
+          </w:tcPr>
+          <w:p>
+            <w:r>
+              <w:rPr>
+                <w:sz w:val="19"/>
+              </w:rPr>
               <w:t>Son módulos del Panel del Adulto (carga comunicativa) del piloto; solo se activan a mano. Desactívelos desde ese mismo panel (CU-15).</w:t>
             </w:r>
           </w:p>
@@ -11725,7 +11935,7 @@
           <w:color w:val="6B7280"/>
           <w:sz w:val="17"/>
         </w:rPr>
-        <w:t>Valeria+ · Manual de Casos de Uso · v8 (con capturas de pantalla) · Julio de 2026 · Terapia auditivo-verbal y del lenguaje para la infancia. Documento de apoyo para logopedas y familias. Disponible en Castellano, Galego (Proxecto Nós) y Dominicano (Quisqueya Habla). Los datos personales se tratan localmente conforme a RGPD/HIPAA; la sincronización en la nube y la telemetría anónima del piloto son opcionales.</w:t>
+        <w:t>Valeria+ · Manual de Casos de Uso · v8.1 (con capturas de pantalla) · Julio de 2026 · Terapia auditivo-verbal y del lenguaje para la infancia. Documento de apoyo para logopedas y familias. Disponible en Castellano, Galego (Proxecto Nós) y Dominicano (Quisqueya Habla). Los datos personales se tratan localmente conforme a RGPD/HIPAA; la sincronización en la nube y la telemetría anónima del piloto son opcionales.</w:t>
       </w:r>
     </w:p>
     <w:sectPr>
@@ -11751,7 +11961,7 @@
         <w:color w:val="6B7280"/>
         <w:sz w:val="16"/>
       </w:rPr>
-      <w:t>Valeria+ · Manual de Casos de Uso · v8 (con capturas de pantalla) · Julio de 2026</w:t>
+      <w:t>Valeria+ · Manual de Casos de Uso · v8.1 (con capturas de pantalla) · Julio de 2026</w:t>
     </w:r>
   </w:p>
 </w:ftr>

</xml_diff>

<commit_message>
docs(academy): documentar el módulo Academy en README y manual de casos de uso
- README: nueva sección "Academy · formación del cuidador", entrada de índice,
  flujo de pantallas, referencia del manual (v8.2, CU‑16) e historial V8.2.
- Manual (HTML): CU‑16 "Academy: formarse con las Cápsulas de Conocimiento",
  entrada de índice, "Novedades de la versión 8.2", FAQ y versión → v8.2.
- build-docx.py: mismas incorporaciones para mantener el DOCX sincronizado.
- Regenerados los exports Valeria-Manual-Casos-de-Uso.docx y .pdf desde las
  fuentes actualizadas.

Co-Authored-By: Claude Opus 4.8 <noreply@anthropic.com>
Claude-Session: https://claude.ai/code/session_014NYcVUyTrfxRTV37BELFf3
</commit_message>
<xml_diff>
--- a/docs/Valeria-Manual-Casos-de-Uso.docx
+++ b/docs/Valeria-Manual-Casos-de-Uso.docx
@@ -61,7 +61,7 @@
           <w:color w:val="00A39E"/>
           <w:sz w:val="20"/>
         </w:rPr>
-        <w:t>Manual de usuario · v8.1 · con capturas de pantalla</w:t>
+        <w:t>Manual de usuario · v8.2 · con capturas de pantalla</w:t>
       </w:r>
     </w:p>
     <w:p>
@@ -452,6 +452,22 @@
       </w:r>
       <w:r>
         <w:t>Panel del Adulto: carga comunicativa (ruido, doble tarea, quiebre)</w:t>
+      </w:r>
+    </w:p>
+    <w:p>
+      <w:pPr>
+        <w:spacing w:after="60"/>
+        <w:ind w:left="227"/>
+      </w:pPr>
+      <w:r>
+        <w:rPr>
+          <w:b/>
+          <w:color w:val="00C4BE"/>
+        </w:rPr>
+        <w:t xml:space="preserve">CU-16   </w:t>
+      </w:r>
+      <w:r>
+        <w:t>Academy: formarse con las Cápsulas de Conocimiento</w:t>
       </w:r>
     </w:p>
     <w:p>
@@ -1628,6 +1644,164 @@
                 <w:sz w:val="19"/>
               </w:rPr>
               <w:t>En galego, la Expansión Semántica y los ejercicios de Audición y Lenguaje (contenido compartido con el castellano) suenan con la voz neuronal castellana mientras Celtia no los cubra, en vez de quedar en silencio en dispositivos sin voz gallega (ver CU-14).</w:t>
+            </w:r>
+          </w:p>
+        </w:tc>
+      </w:tr>
+    </w:tbl>
+    <w:p>
+      <w:pPr>
+        <w:spacing w:after="40"/>
+      </w:pPr>
+    </w:p>
+    <w:p>
+      <w:pPr>
+        <w:pStyle w:val="Heading3"/>
+      </w:pPr>
+      <w:r>
+        <w:t>Novedades de la versión 8.2</w:t>
+      </w:r>
+    </w:p>
+    <w:p>
+      <w:pPr>
+        <w:spacing w:after="120"/>
+      </w:pPr>
+      <w:r>
+        <w:rPr>
+          <w:b w:val="0"/>
+          <w:i w:val="0"/>
+        </w:rPr>
+        <w:t>La versión 8.2 suma Academy, un espacio de formación para el adulto. En la terapia auditivo-verbal el cuidador es quien dirige cada sesión, así que aprender a hacerlo bien forma parte del tratamiento. Academy no es para el niño: es para quien lo acompaña.</w:t>
+      </w:r>
+    </w:p>
+    <w:tbl>
+      <w:tblPr>
+        <w:tblStyle w:val="TableGrid"/>
+        <w:tblW w:type="auto" w:w="0"/>
+        <w:jc w:val="center"/>
+        <w:tblLook w:firstColumn="1" w:firstRow="1" w:lastColumn="0" w:lastRow="0" w:noHBand="0" w:noVBand="1" w:val="04A0"/>
+      </w:tblPr>
+      <w:tblGrid>
+        <w:gridCol w:w="4819"/>
+        <w:gridCol w:w="4819"/>
+      </w:tblGrid>
+      <w:tr>
+        <w:tc>
+          <w:tcPr>
+            <w:tcW w:type="dxa" w:w="2721"/>
+            <w:shd w:val="clear" w:fill="E6F9F8"/>
+          </w:tcPr>
+          <w:p>
+            <w:r>
+              <w:rPr>
+                <w:b/>
+                <w:color w:val="00A39E"/>
+                <w:sz w:val="18"/>
+              </w:rPr>
+              <w:t>Novedad</w:t>
+            </w:r>
+          </w:p>
+        </w:tc>
+        <w:tc>
+          <w:tcPr>
+            <w:tcW w:type="dxa" w:w="6917"/>
+            <w:shd w:val="clear" w:fill="E6F9F8"/>
+          </w:tcPr>
+          <w:p>
+            <w:r>
+              <w:rPr>
+                <w:b/>
+                <w:color w:val="00A39E"/>
+                <w:sz w:val="18"/>
+              </w:rPr>
+              <w:t>Qué aporta</w:t>
+            </w:r>
+          </w:p>
+        </w:tc>
+      </w:tr>
+      <w:tr>
+        <w:tc>
+          <w:tcPr>
+            <w:tcW w:type="dxa" w:w="2721"/>
+          </w:tcPr>
+          <w:p>
+            <w:r>
+              <w:rPr>
+                <w:b/>
+                <w:sz w:val="19"/>
+              </w:rPr>
+              <w:t>🎓 Academy</w:t>
+            </w:r>
+          </w:p>
+        </w:tc>
+        <w:tc>
+          <w:tcPr>
+            <w:tcW w:type="dxa" w:w="6917"/>
+          </w:tcPr>
+          <w:p>
+            <w:r>
+              <w:rPr>
+                <w:sz w:val="19"/>
+              </w:rPr>
+              <w:t>Una tarjeta destacada en la pantalla de terapias abre un curso breve de Cápsulas de Conocimiento (unos 2 minutos cada una) sobre cómo aprenden a hablar los niños, el porqué de las dinámicas de movimiento (TPR) y los vicios a evitar durante la terapia en casa (ver CU-16).</w:t>
+            </w:r>
+          </w:p>
+        </w:tc>
+      </w:tr>
+      <w:tr>
+        <w:tc>
+          <w:tcPr>
+            <w:tcW w:type="dxa" w:w="2721"/>
+          </w:tcPr>
+          <w:p>
+            <w:r>
+              <w:rPr>
+                <w:b/>
+                <w:sz w:val="19"/>
+              </w:rPr>
+              <w:t>✅ Quiz rápido</w:t>
+            </w:r>
+          </w:p>
+        </w:tc>
+        <w:tc>
+          <w:tcPr>
+            <w:tcW w:type="dxa" w:w="6917"/>
+          </w:tcPr>
+          <w:p>
+            <w:r>
+              <w:rPr>
+                <w:sz w:val="19"/>
+              </w:rPr>
+              <w:t>Cada cápsula termina con un mini-test de una o dos preguntas con respuesta explicada, para fijar la idea sin que se haga pesado.</w:t>
+            </w:r>
+          </w:p>
+        </w:tc>
+      </w:tr>
+      <w:tr>
+        <w:tc>
+          <w:tcPr>
+            <w:tcW w:type="dxa" w:w="2721"/>
+          </w:tcPr>
+          <w:p>
+            <w:r>
+              <w:rPr>
+                <w:b/>
+                <w:sz w:val="19"/>
+              </w:rPr>
+              <w:t>📊 Progreso visible</w:t>
+            </w:r>
+          </w:p>
+        </w:tc>
+        <w:tc>
+          <w:tcPr>
+            <w:tcW w:type="dxa" w:w="6917"/>
+          </w:tcPr>
+          <w:p>
+            <w:r>
+              <w:rPr>
+                <w:sz w:val="19"/>
+              </w:rPr>
+              <w:t>La tarjeta muestra una barra de avance, el nivel (de Novato a Cuidador experto), los puntos y las insignias, que se actualizan al instante al completar una cápsula. El avance se guarda cifrado en el dispositivo.</w:t>
             </w:r>
           </w:p>
         </w:tc>
@@ -11341,6 +11515,633 @@
         <w:br w:type="page"/>
       </w:r>
     </w:p>
+    <w:tbl>
+      <w:tblPr>
+        <w:tblW w:type="auto" w:w="0"/>
+        <w:jc w:val="center"/>
+        <w:tblLook w:firstColumn="1" w:firstRow="1" w:lastColumn="0" w:lastRow="0" w:noHBand="0" w:noVBand="1" w:val="04A0"/>
+      </w:tblPr>
+      <w:tblGrid>
+        <w:gridCol w:w="9638"/>
+      </w:tblGrid>
+      <w:tr>
+        <w:tc>
+          <w:tcPr>
+            <w:tcW w:type="dxa" w:w="9638"/>
+            <w:shd w:val="clear" w:fill="00C4BE"/>
+          </w:tcPr>
+          <w:p>
+            <w:pPr>
+              <w:spacing w:before="80"/>
+            </w:pPr>
+            <w:r>
+              <w:rPr>
+                <w:b/>
+                <w:color w:val="F0FDF9"/>
+                <w:sz w:val="17"/>
+              </w:rPr>
+              <w:t>CU-16 · Familia</w:t>
+            </w:r>
+          </w:p>
+          <w:p>
+            <w:pPr>
+              <w:spacing w:after="80"/>
+            </w:pPr>
+            <w:r>
+              <w:rPr>
+                <w:b/>
+                <w:color w:val="FFFFFF"/>
+                <w:sz w:val="28"/>
+              </w:rPr>
+              <w:t>Academy: formarse con las Cápsulas de Conocimiento</w:t>
+            </w:r>
+          </w:p>
+        </w:tc>
+      </w:tr>
+    </w:tbl>
+    <w:tbl>
+      <w:tblPr>
+        <w:tblW w:type="auto" w:w="0"/>
+        <w:jc w:val="center"/>
+        <w:tblLook w:firstColumn="1" w:firstRow="1" w:lastColumn="0" w:lastRow="0" w:noHBand="0" w:noVBand="1" w:val="04A0"/>
+      </w:tblPr>
+      <w:tblGrid>
+        <w:gridCol w:w="4819"/>
+        <w:gridCol w:w="4819"/>
+      </w:tblGrid>
+      <w:tr>
+        <w:tc>
+          <w:tcPr>
+            <w:tcW w:type="dxa" w:w="4819"/>
+          </w:tcPr>
+          <w:p>
+            <w:r>
+              <w:rPr>
+                <w:b/>
+                <w:color w:val="6B7280"/>
+                <w:sz w:val="15"/>
+              </w:rPr>
+              <w:t>ACTOR</w:t>
+            </w:r>
+          </w:p>
+          <w:p>
+            <w:r>
+              <w:rPr>
+                <w:b/>
+                <w:sz w:val="19"/>
+              </w:rPr>
+              <w:t>Adulto que dirige la sesión (familia o cuidador)</w:t>
+            </w:r>
+          </w:p>
+        </w:tc>
+        <w:tc>
+          <w:tcPr>
+            <w:tcW w:type="dxa" w:w="4819"/>
+          </w:tcPr>
+          <w:p>
+            <w:r>
+              <w:rPr>
+                <w:b/>
+                <w:color w:val="6B7280"/>
+                <w:sz w:val="15"/>
+              </w:rPr>
+              <w:t>PANTALLA</w:t>
+            </w:r>
+          </w:p>
+          <w:p>
+            <w:r>
+              <w:rPr>
+                <w:b/>
+                <w:sz w:val="19"/>
+              </w:rPr>
+              <w:t>Prescripción de Terapias → Academy</w:t>
+            </w:r>
+          </w:p>
+        </w:tc>
+      </w:tr>
+      <w:tr>
+        <w:tc>
+          <w:tcPr>
+            <w:tcW w:type="dxa" w:w="4819"/>
+          </w:tcPr>
+          <w:p>
+            <w:r>
+              <w:rPr>
+                <w:b/>
+                <w:color w:val="6B7280"/>
+                <w:sz w:val="15"/>
+              </w:rPr>
+              <w:t>PRECONDICIÓN</w:t>
+            </w:r>
+          </w:p>
+          <w:p>
+            <w:r>
+              <w:rPr>
+                <w:b/>
+                <w:sz w:val="19"/>
+              </w:rPr>
+              <w:t>Ninguna; disponible desde el primer día</w:t>
+            </w:r>
+          </w:p>
+        </w:tc>
+        <w:tc>
+          <w:tcPr>
+            <w:tcW w:type="dxa" w:w="4819"/>
+          </w:tcPr>
+          <w:p>
+            <w:r>
+              <w:rPr>
+                <w:b/>
+                <w:color w:val="6B7280"/>
+                <w:sz w:val="15"/>
+              </w:rPr>
+              <w:t>RESULTADO</w:t>
+            </w:r>
+          </w:p>
+          <w:p>
+            <w:r>
+              <w:rPr>
+                <w:b/>
+                <w:sz w:val="19"/>
+              </w:rPr>
+              <w:t>Cápsula completada y progreso guardado</w:t>
+            </w:r>
+          </w:p>
+        </w:tc>
+      </w:tr>
+    </w:tbl>
+    <w:p>
+      <w:pPr>
+        <w:spacing w:after="40"/>
+      </w:pPr>
+    </w:p>
+    <w:p>
+      <w:pPr>
+        <w:spacing w:after="120"/>
+      </w:pPr>
+      <w:r>
+        <w:rPr>
+          <w:b w:val="0"/>
+          <w:i w:val="0"/>
+        </w:rPr>
+        <w:t>Academy es el espacio de formación para el adulto. En la terapia auditivo-verbal la persona que acompaña al niño es el motor de la sesión, así que Academy le enseña —en pequeñas dosis— a hacerlo mejor. Aparece como una tarjeta destacada “Academy” en la pantalla de terapias, con una barra de progreso siempre a la vista.</w:t>
+      </w:r>
+    </w:p>
+    <w:tbl>
+      <w:tblPr>
+        <w:tblStyle w:val="TableGrid"/>
+        <w:tblW w:type="auto" w:w="0"/>
+        <w:jc w:val="center"/>
+        <w:tblLook w:firstColumn="1" w:firstRow="1" w:lastColumn="0" w:lastRow="0" w:noHBand="0" w:noVBand="1" w:val="04A0"/>
+      </w:tblPr>
+      <w:tblGrid>
+        <w:gridCol w:w="4819"/>
+        <w:gridCol w:w="4819"/>
+      </w:tblGrid>
+      <w:tr>
+        <w:tc>
+          <w:tcPr>
+            <w:tcW w:type="dxa" w:w="2721"/>
+            <w:shd w:val="clear" w:fill="E6F9F8"/>
+          </w:tcPr>
+          <w:p>
+            <w:r>
+              <w:rPr>
+                <w:b/>
+                <w:color w:val="00A39E"/>
+                <w:sz w:val="18"/>
+              </w:rPr>
+              <w:t>Tema</w:t>
+            </w:r>
+          </w:p>
+        </w:tc>
+        <w:tc>
+          <w:tcPr>
+            <w:tcW w:type="dxa" w:w="6917"/>
+            <w:shd w:val="clear" w:fill="E6F9F8"/>
+          </w:tcPr>
+          <w:p>
+            <w:r>
+              <w:rPr>
+                <w:b/>
+                <w:color w:val="00A39E"/>
+                <w:sz w:val="18"/>
+              </w:rPr>
+              <w:t>Qué se aprende</w:t>
+            </w:r>
+          </w:p>
+        </w:tc>
+      </w:tr>
+      <w:tr>
+        <w:tc>
+          <w:tcPr>
+            <w:tcW w:type="dxa" w:w="2721"/>
+          </w:tcPr>
+          <w:p>
+            <w:r>
+              <w:rPr>
+                <w:b/>
+                <w:sz w:val="19"/>
+              </w:rPr>
+              <w:t>👂 Cómo aprenden a hablar</w:t>
+            </w:r>
+          </w:p>
+        </w:tc>
+        <w:tc>
+          <w:tcPr>
+            <w:tcW w:type="dxa" w:w="6917"/>
+          </w:tcPr>
+          <w:p>
+            <w:r>
+              <w:rPr>
+                <w:sz w:val="19"/>
+              </w:rPr>
+              <w:t>Que el niño escucha mucho antes de hablar y que la conversación por turnos —y saber esperar en silencio— es lo que impulsa el lenguaje.</w:t>
+            </w:r>
+          </w:p>
+        </w:tc>
+      </w:tr>
+      <w:tr>
+        <w:tc>
+          <w:tcPr>
+            <w:tcW w:type="dxa" w:w="2721"/>
+          </w:tcPr>
+          <w:p>
+            <w:r>
+              <w:rPr>
+                <w:b/>
+                <w:sz w:val="19"/>
+              </w:rPr>
+              <w:t>🤸 Por qué moverse (TPR)</w:t>
+            </w:r>
+          </w:p>
+        </w:tc>
+        <w:tc>
+          <w:tcPr>
+            <w:tcW w:type="dxa" w:w="6917"/>
+          </w:tcPr>
+          <w:p>
+            <w:r>
+              <w:rPr>
+                <w:sz w:val="19"/>
+              </w:rPr>
+              <w:t>Unir sonido y movimiento ayuda a recordar y quita la presión de “tener que hablar”; por eso es el adulto quien confirma si el niño cumplió la orden.</w:t>
+            </w:r>
+          </w:p>
+        </w:tc>
+      </w:tr>
+      <w:tr>
+        <w:tc>
+          <w:tcPr>
+            <w:tcW w:type="dxa" w:w="2721"/>
+          </w:tcPr>
+          <w:p>
+            <w:r>
+              <w:rPr>
+                <w:b/>
+                <w:sz w:val="19"/>
+              </w:rPr>
+              <w:t>🚫 Vicios a evitar</w:t>
+            </w:r>
+          </w:p>
+        </w:tc>
+        <w:tc>
+          <w:tcPr>
+            <w:tcW w:type="dxa" w:w="6917"/>
+          </w:tcPr>
+          <w:p>
+            <w:r>
+              <w:rPr>
+                <w:sz w:val="19"/>
+              </w:rPr>
+              <w:t>No decir “así no se dice” sino repetir bien la palabra dentro de la frase; y comentar más que preguntar para que la sesión no parezca un examen.</w:t>
+            </w:r>
+          </w:p>
+        </w:tc>
+      </w:tr>
+      <w:tr>
+        <w:tc>
+          <w:tcPr>
+            <w:tcW w:type="dxa" w:w="2721"/>
+          </w:tcPr>
+          <w:p>
+            <w:r>
+              <w:rPr>
+                <w:b/>
+                <w:sz w:val="19"/>
+              </w:rPr>
+              <w:t>🧑‍🏫 Terapia mediada</w:t>
+            </w:r>
+          </w:p>
+        </w:tc>
+        <w:tc>
+          <w:tcPr>
+            <w:tcW w:type="dxa" w:w="6917"/>
+          </w:tcPr>
+          <w:p>
+            <w:r>
+              <w:rPr>
+                <w:sz w:val="19"/>
+              </w:rPr>
+              <w:t>La app es la herramienta; el terapeuta en casa es el adulto, que puede parar cuando haga falta: no hay un mínimo que cumplir.</w:t>
+            </w:r>
+          </w:p>
+        </w:tc>
+      </w:tr>
+    </w:tbl>
+    <w:p>
+      <w:pPr>
+        <w:spacing w:after="40"/>
+      </w:pPr>
+    </w:p>
+    <w:p>
+      <w:pPr>
+        <w:keepNext/>
+        <w:spacing w:after="60" w:before="160"/>
+      </w:pPr>
+      <w:r>
+        <w:rPr>
+          <w:b/>
+          <w:i w:val="0"/>
+          <w:color w:val="4B5563"/>
+          <w:sz w:val="21"/>
+        </w:rPr>
+        <w:t>Flujo principal</w:t>
+      </w:r>
+    </w:p>
+    <w:p>
+      <w:pPr>
+        <w:spacing w:after="60"/>
+        <w:ind w:left="454" w:hanging="255"/>
+      </w:pPr>
+      <w:r>
+        <w:rPr>
+          <w:b/>
+        </w:rPr>
+        <w:t xml:space="preserve">1. </w:t>
+      </w:r>
+      <w:r>
+        <w:rPr>
+          <w:b w:val="0"/>
+        </w:rPr>
+        <w:t xml:space="preserve">En </w:t>
+      </w:r>
+      <w:r>
+        <w:rPr>
+          <w:b/>
+        </w:rPr>
+        <w:t>Prescripción de Terapias</w:t>
+      </w:r>
+      <w:r>
+        <w:rPr>
+          <w:b w:val="0"/>
+        </w:rPr>
+        <w:t xml:space="preserve">, pulsar la tarjeta </w:t>
+      </w:r>
+      <w:r>
+        <w:rPr>
+          <w:b/>
+        </w:rPr>
+        <w:t>“Academy”</w:t>
+      </w:r>
+      <w:r>
+        <w:rPr>
+          <w:b w:val="0"/>
+        </w:rPr>
+        <w:t xml:space="preserve"> (bajo el rótulo “Tu formación”).</w:t>
+      </w:r>
+    </w:p>
+    <w:p>
+      <w:pPr>
+        <w:spacing w:after="60"/>
+        <w:ind w:left="454" w:hanging="255"/>
+      </w:pPr>
+      <w:r>
+        <w:rPr>
+          <w:b/>
+        </w:rPr>
+        <w:t xml:space="preserve">2. </w:t>
+      </w:r>
+      <w:r>
+        <w:rPr>
+          <w:b w:val="0"/>
+        </w:rPr>
+        <w:t xml:space="preserve">Elegir una </w:t>
+      </w:r>
+      <w:r>
+        <w:rPr>
+          <w:b/>
+        </w:rPr>
+        <w:t>Cápsula de Conocimiento</w:t>
+      </w:r>
+      <w:r>
+        <w:rPr>
+          <w:b w:val="0"/>
+        </w:rPr>
+        <w:t xml:space="preserve"> de la lista (unos 2 minutos cada una).</w:t>
+      </w:r>
+    </w:p>
+    <w:p>
+      <w:pPr>
+        <w:spacing w:after="60"/>
+        <w:ind w:left="454" w:hanging="255"/>
+      </w:pPr>
+      <w:r>
+        <w:rPr>
+          <w:b/>
+        </w:rPr>
+        <w:t xml:space="preserve">3. </w:t>
+      </w:r>
+      <w:r>
+        <w:rPr>
+          <w:b w:val="0"/>
+        </w:rPr>
+        <w:t xml:space="preserve">Leer las </w:t>
+      </w:r>
+      <w:r>
+        <w:rPr>
+          <w:b/>
+        </w:rPr>
+        <w:t>diapositivas</w:t>
+      </w:r>
+      <w:r>
+        <w:rPr>
+          <w:b w:val="0"/>
+        </w:rPr>
+        <w:t xml:space="preserve"> avanzando con “Siguiente”.</w:t>
+      </w:r>
+    </w:p>
+    <w:p>
+      <w:pPr>
+        <w:spacing w:after="60"/>
+        <w:ind w:left="454" w:hanging="255"/>
+      </w:pPr>
+      <w:r>
+        <w:rPr>
+          <w:b/>
+        </w:rPr>
+        <w:t xml:space="preserve">4. </w:t>
+      </w:r>
+      <w:r>
+        <w:rPr>
+          <w:b w:val="0"/>
+        </w:rPr>
+        <w:t xml:space="preserve">Responder el </w:t>
+      </w:r>
+      <w:r>
+        <w:rPr>
+          <w:b/>
+        </w:rPr>
+        <w:t>quiz rápido</w:t>
+      </w:r>
+      <w:r>
+        <w:rPr>
+          <w:b w:val="0"/>
+        </w:rPr>
+        <w:t xml:space="preserve"> del final; cada respuesta muestra una breve explicación.</w:t>
+      </w:r>
+    </w:p>
+    <w:p>
+      <w:pPr>
+        <w:spacing w:after="60"/>
+        <w:ind w:left="454" w:hanging="255"/>
+      </w:pPr>
+      <w:r>
+        <w:rPr>
+          <w:b/>
+        </w:rPr>
+        <w:t xml:space="preserve">5. </w:t>
+      </w:r>
+      <w:r>
+        <w:rPr>
+          <w:b w:val="0"/>
+        </w:rPr>
+        <w:t xml:space="preserve">Al aprobar, la app suma </w:t>
+      </w:r>
+      <w:r>
+        <w:rPr>
+          <w:b/>
+        </w:rPr>
+        <w:t>puntos e insignias</w:t>
+      </w:r>
+      <w:r>
+        <w:rPr>
+          <w:b w:val="0"/>
+        </w:rPr>
+        <w:t xml:space="preserve"> y la </w:t>
+      </w:r>
+      <w:r>
+        <w:rPr>
+          <w:b/>
+        </w:rPr>
+        <w:t>barra de la tarjeta avanza al instante</w:t>
+      </w:r>
+      <w:r>
+        <w:rPr>
+          <w:b w:val="0"/>
+        </w:rPr>
+        <w:t>.</w:t>
+      </w:r>
+    </w:p>
+    <w:tbl>
+      <w:tblPr>
+        <w:tblW w:type="auto" w:w="0"/>
+        <w:jc w:val="center"/>
+        <w:tblLook w:firstColumn="1" w:firstRow="1" w:lastColumn="0" w:lastRow="0" w:noHBand="0" w:noVBand="1" w:val="04A0"/>
+      </w:tblPr>
+      <w:tblGrid>
+        <w:gridCol w:w="9638"/>
+      </w:tblGrid>
+      <w:tr>
+        <w:tc>
+          <w:tcPr>
+            <w:tcW w:type="dxa" w:w="9638"/>
+            <w:shd w:val="clear" w:fill="F0FDF9"/>
+          </w:tcPr>
+          <w:p>
+            <w:pPr>
+              <w:spacing w:after="40"/>
+            </w:pPr>
+            <w:r>
+              <w:rPr>
+                <w:b/>
+                <w:color w:val="00A39E"/>
+                <w:sz w:val="17"/>
+              </w:rPr>
+              <w:t>ES PARA EL ADULTO, NO PARA EL NIÑO</w:t>
+            </w:r>
+          </w:p>
+          <w:p>
+            <w:pPr>
+              <w:spacing w:after="40"/>
+            </w:pPr>
+            <w:r>
+              <w:rPr>
+                <w:sz w:val="19"/>
+              </w:rPr>
+              <w:t>Academy vive junto a los menús de la app, que maneja siempre el adulto; la tableta se cede al niño solo cuando el ejercicio ya ha empezado. Por eso el niño no llega por error a esta formación.</w:t>
+            </w:r>
+          </w:p>
+        </w:tc>
+      </w:tr>
+    </w:tbl>
+    <w:p>
+      <w:pPr>
+        <w:spacing w:after="40"/>
+      </w:pPr>
+    </w:p>
+    <w:tbl>
+      <w:tblPr>
+        <w:tblW w:type="auto" w:w="0"/>
+        <w:jc w:val="center"/>
+        <w:tblLook w:firstColumn="1" w:firstRow="1" w:lastColumn="0" w:lastRow="0" w:noHBand="0" w:noVBand="1" w:val="04A0"/>
+      </w:tblPr>
+      <w:tblGrid>
+        <w:gridCol w:w="9638"/>
+      </w:tblGrid>
+      <w:tr>
+        <w:tc>
+          <w:tcPr>
+            <w:tcW w:type="dxa" w:w="9638"/>
+            <w:shd w:val="clear" w:fill="F0FDF9"/>
+          </w:tcPr>
+          <w:p>
+            <w:pPr>
+              <w:spacing w:after="40"/>
+            </w:pPr>
+            <w:r>
+              <w:rPr>
+                <w:b/>
+                <w:color w:val="00A39E"/>
+                <w:sz w:val="17"/>
+              </w:rPr>
+              <w:t>EL PROGRESO NO SE PIERDE</w:t>
+            </w:r>
+          </w:p>
+          <w:p>
+            <w:pPr>
+              <w:spacing w:after="40"/>
+            </w:pPr>
+            <w:r>
+              <w:rPr>
+                <w:sz w:val="19"/>
+              </w:rPr>
+              <w:t>El avance (cápsulas hechas, nivel e insignias) se guarda cifrado en el dispositivo, igual que el resto de datos, y funciona sin conexión.</w:t>
+            </w:r>
+          </w:p>
+        </w:tc>
+      </w:tr>
+    </w:tbl>
+    <w:p>
+      <w:pPr>
+        <w:spacing w:after="40"/>
+      </w:pPr>
+    </w:p>
+    <w:p>
+      <w:r>
+        <w:br w:type="page"/>
+      </w:r>
+    </w:p>
     <w:p>
       <w:pPr>
         <w:keepNext/>
@@ -11913,6 +12714,34 @@
           </w:p>
         </w:tc>
       </w:tr>
+      <w:tr>
+        <w:tc>
+          <w:tcPr>
+            <w:tcW w:type="dxa" w:w="3402"/>
+          </w:tcPr>
+          <w:p>
+            <w:r>
+              <w:rPr>
+                <w:sz w:val="19"/>
+              </w:rPr>
+              <w:t>¿Qué es la tarjeta “Academy” del hub?</w:t>
+            </w:r>
+          </w:p>
+        </w:tc>
+        <w:tc>
+          <w:tcPr>
+            <w:tcW w:type="dxa" w:w="6236"/>
+          </w:tcPr>
+          <w:p>
+            <w:r>
+              <w:rPr>
+                <w:sz w:val="19"/>
+              </w:rPr>
+              <w:t>Es la formación para el adulto: cápsulas breves sobre cómo aprenden a hablar los niños, el porqué del movimiento (TPR) y los vicios a evitar, con un quiz rápido. No es un ejercicio para el niño (CU-16).</w:t>
+            </w:r>
+          </w:p>
+        </w:tc>
+      </w:tr>
     </w:tbl>
     <w:p>
       <w:pPr>
@@ -11935,7 +12764,7 @@
           <w:color w:val="6B7280"/>
           <w:sz w:val="17"/>
         </w:rPr>
-        <w:t>Valeria+ · Manual de Casos de Uso · v8.1 (con capturas de pantalla) · Julio de 2026 · Terapia auditivo-verbal y del lenguaje para la infancia. Documento de apoyo para logopedas y familias. Disponible en Castellano, Galego (Proxecto Nós) y Dominicano (Quisqueya Habla). Los datos personales se tratan localmente conforme a RGPD/HIPAA; la sincronización en la nube y la telemetría anónima del piloto son opcionales.</w:t>
+        <w:t>Valeria+ · Manual de Casos de Uso · v8.2 (con capturas de pantalla) · Julio de 2026 · Terapia auditivo-verbal y del lenguaje para la infancia. Documento de apoyo para logopedas y familias. Disponible en Castellano, Galego (Proxecto Nós) y Dominicano (Quisqueya Habla). Los datos personales se tratan localmente conforme a RGPD/HIPAA; la sincronización en la nube y la telemetría anónima del piloto son opcionales.</w:t>
       </w:r>
     </w:p>
     <w:sectPr>
@@ -11961,7 +12790,7 @@
         <w:color w:val="6B7280"/>
         <w:sz w:val="16"/>
       </w:rPr>
-      <w:t>Valeria+ · Manual de Casos de Uso · v8.1 (con capturas de pantalla) · Julio de 2026</w:t>
+      <w:t>Valeria+ · Manual de Casos de Uso · v8.2 (con capturas de pantalla) · Julio de 2026</w:t>
     </w:r>
   </w:p>
 </w:ftr>

</xml_diff>

<commit_message>
docs: mover Academy a CU-03 (uno de los primeros casos) en el manual
En la terapia auditivo-verbal el cuidador dirige la sesión, así que la
formación (Academy) debe venir antes de los bloques de terapia. Se reubica
el caso de uso de Academy de CU-16 a CU-03, justo tras el hub, y se renumeran
CU-03..CU-15 -> CU-04..CU-16 con todas las referencias cruzadas.

- HTML y build-docx.py: sección Academy movida a la tercera posición; índice
  y todas las referencias (ver CU-NN) actualizadas de forma coherente.
- CU-02 (hub): nuevo paso y callout que recomiendan empezar por Academy.
- DOCX y PDF regenerados desde las fuentes.
- README: referencia del manual actualizada (Academy = CU-03).

Co-Authored-By: Claude Opus 4.8 <noreply@anthropic.com>
Claude-Session: https://claude.ai/code/session_01QNVza72RMppHTsViSPHLFQ
</commit_message>
<xml_diff>
--- a/docs/Valeria-Manual-Casos-de-Uso.docx
+++ b/docs/Valeria-Manual-Casos-de-Uso.docx
@@ -259,7 +259,7 @@
         <w:t xml:space="preserve">CU-03   </w:t>
       </w:r>
       <w:r>
-        <w:t>Pares Mínimos para dislalias</w:t>
+        <w:t>Academy: formarse con las Cápsulas de Conocimiento</w:t>
       </w:r>
     </w:p>
     <w:p>
@@ -275,7 +275,7 @@
         <w:t xml:space="preserve">CU-04   </w:t>
       </w:r>
       <w:r>
-        <w:t>Expansión Semántica / progresión léxica</w:t>
+        <w:t>Pares Mínimos para dislalias</w:t>
       </w:r>
     </w:p>
     <w:p>
@@ -291,7 +291,7 @@
         <w:t xml:space="preserve">CU-05   </w:t>
       </w:r>
       <w:r>
-        <w:t>Prescribir terapias de Audición y Lenguaje (Modo Profesional)</w:t>
+        <w:t>Expansión Semántica / progresión léxica</w:t>
       </w:r>
     </w:p>
     <w:p>
@@ -307,7 +307,7 @@
         <w:t xml:space="preserve">CU-06   </w:t>
       </w:r>
       <w:r>
-        <w:t>Retomar un paciente e iniciar sesión</w:t>
+        <w:t>Prescribir terapias de Audición y Lenguaje (Modo Profesional)</w:t>
       </w:r>
     </w:p>
     <w:p>
@@ -323,7 +323,7 @@
         <w:t xml:space="preserve">CU-07   </w:t>
       </w:r>
       <w:r>
-        <w:t>Test de Ling previo (audífono / implante)</w:t>
+        <w:t>Retomar un paciente e iniciar sesión</w:t>
       </w:r>
     </w:p>
     <w:p>
@@ -339,7 +339,7 @@
         <w:t xml:space="preserve">CU-08   </w:t>
       </w:r>
       <w:r>
-        <w:t>Realizar una sesión de ejercicios</w:t>
+        <w:t>Test de Ling previo (audífono / implante)</w:t>
       </w:r>
     </w:p>
     <w:p>
@@ -355,7 +355,7 @@
         <w:t xml:space="preserve">CU-09   </w:t>
       </w:r>
       <w:r>
-        <w:t>Configurar recordatorios diarios</w:t>
+        <w:t>Realizar una sesión de ejercicios</w:t>
       </w:r>
     </w:p>
     <w:p>
@@ -371,7 +371,7 @@
         <w:t xml:space="preserve">CU-10   </w:t>
       </w:r>
       <w:r>
-        <w:t>Motivación: racha, niveles e insignias</w:t>
+        <w:t>Configurar recordatorios diarios</w:t>
       </w:r>
     </w:p>
     <w:p>
@@ -387,7 +387,7 @@
         <w:t xml:space="preserve">CU-11   </w:t>
       </w:r>
       <w:r>
-        <w:t>Consultar el panel de resultados</w:t>
+        <w:t>Motivación: racha, niveles e insignias</w:t>
       </w:r>
     </w:p>
     <w:p>
@@ -403,7 +403,7 @@
         <w:t xml:space="preserve">CU-12   </w:t>
       </w:r>
       <w:r>
-        <w:t>Cambiar entre Modo Familia y Modo Profesional</w:t>
+        <w:t>Consultar el panel de resultados</w:t>
       </w:r>
     </w:p>
     <w:p>
@@ -419,7 +419,7 @@
         <w:t xml:space="preserve">CU-13   </w:t>
       </w:r>
       <w:r>
-        <w:t>Exportar la evidencia de usabilidad del piloto (QR + compartir)</w:t>
+        <w:t>Cambiar entre Modo Familia y Modo Profesional</w:t>
       </w:r>
     </w:p>
     <w:p>
@@ -435,7 +435,7 @@
         <w:t xml:space="preserve">CU-14   </w:t>
       </w:r>
       <w:r>
-        <w:t>Elegir la variedad de terapia (Castellano · Galego · Dominicano)</w:t>
+        <w:t>Exportar la evidencia de usabilidad del piloto (QR + compartir)</w:t>
       </w:r>
     </w:p>
     <w:p>
@@ -451,7 +451,7 @@
         <w:t xml:space="preserve">CU-15   </w:t>
       </w:r>
       <w:r>
-        <w:t>Panel del Adulto: carga comunicativa (ruido, doble tarea, quiebre)</w:t>
+        <w:t>Elegir la variedad de terapia (Castellano · Galego · Dominicano)</w:t>
       </w:r>
     </w:p>
     <w:p>
@@ -467,7 +467,7 @@
         <w:t xml:space="preserve">CU-16   </w:t>
       </w:r>
       <w:r>
-        <w:t>Academy: formarse con las Cápsulas de Conocimiento</w:t>
+        <w:t>Panel del Adulto: carga comunicativa (ruido, doble tarea, quiebre)</w:t>
       </w:r>
     </w:p>
     <w:p>
@@ -1269,7 +1269,7 @@
               <w:rPr>
                 <w:sz w:val="19"/>
               </w:rPr>
-              <w:t>Con el PIN profesional, la app genera a la vez un código QR con el resumen (offline, escaneable) y abre el menú de compartir para enviar el registro completo por email o WhatsApp cuando haya conexión (ver CU-13).</w:t>
+              <w:t>Con el PIN profesional, la app genera a la vez un código QR con el resumen (offline, escaneable) y abre el menú de compartir para enviar el registro completo por email o WhatsApp cuando haya conexión (ver CU-14).</w:t>
             </w:r>
           </w:p>
         </w:tc>
@@ -1369,7 +1369,7 @@
               <w:rPr>
                 <w:sz w:val="19"/>
               </w:rPr>
-              <w:t>El contenido se locuta y evalúa en Castellano, Galego (Proxecto Nós) o Dominicano (es-DO, Quisqueya Habla), elegibles en la tarjeta “Voz de la app” (ver CU-14). Cada variedad usa su propio banco de pares mínimos.</w:t>
+              <w:t>El contenido se locuta y evalúa en Castellano, Galego (Proxecto Nós) o Dominicano (es-DO, Quisqueya Habla), elegibles en la tarjeta “Voz de la app” (ver CU-15). Cada variedad usa su propio banco de pares mínimos.</w:t>
             </w:r>
           </w:p>
         </w:tc>
@@ -1456,7 +1456,7 @@
               <w:rPr>
                 <w:sz w:val="19"/>
               </w:rPr>
-              <w:t>Tres módulos manuales para el piloto (escucha en ruido, oso distractor de doble tarea y quiebre pragmático). Los activa siempre el adulto: la app nunca ajusta nada sola (ver CU-15).</w:t>
+              <w:t>Tres módulos manuales para el piloto (escucha en ruido, oso distractor de doble tarea y quiebre pragmático). Los activa siempre el adulto: la app nunca ajusta nada sola (ver CU-16).</w:t>
             </w:r>
           </w:p>
         </w:tc>
@@ -1585,7 +1585,7 @@
               <w:rPr>
                 <w:sz w:val="19"/>
               </w:rPr>
-              <w:t>En Bienvenida, “Ya tengo un paciente registrado” deja de ser un enlace pequeño y pasa a ser un botón de tamaño completo, al nivel de “Comenzar” (ver CU-06).</w:t>
+              <w:t>En Bienvenida, “Ya tengo un paciente registrado” deja de ser un enlace pequeño y pasa a ser un botón de tamaño completo, al nivel de “Comenzar” (ver CU-07).</w:t>
             </w:r>
           </w:p>
         </w:tc>
@@ -1614,7 +1614,7 @@
               <w:rPr>
                 <w:sz w:val="19"/>
               </w:rPr>
-              <w:t>La cabecera del panel de resultados y del Test de Ling, y el informe que se comparte, muestran ahora el nombre y NHC de la ficha registrada (antes aparecía un dato de muestra fijo). Si no hay ficha, se indica con un rótulo neutro (ver CU-07 y CU-11).</w:t>
+              <w:t>La cabecera del panel de resultados y del Test de Ling, y el informe que se comparte, muestran ahora el nombre y NHC de la ficha registrada (antes aparecía un dato de muestra fijo). Si no hay ficha, se indica con un rótulo neutro (ver CU-08 y CU-12).</w:t>
             </w:r>
           </w:p>
         </w:tc>
@@ -1643,7 +1643,7 @@
               <w:rPr>
                 <w:sz w:val="19"/>
               </w:rPr>
-              <w:t>En galego, la Expansión Semántica y los ejercicios de Audición y Lenguaje (contenido compartido con el castellano) suenan con la voz neuronal castellana mientras Celtia no los cubra, en vez de quedar en silencio en dispositivos sin voz gallega (ver CU-14).</w:t>
+              <w:t>En galego, la Expansión Semántica y los ejercicios de Audición y Lenguaje (contenido compartido con el castellano) suenan con la voz neuronal castellana mientras Celtia no los cubra, en vez de quedar en silencio en dispositivos sin voz gallega (ver CU-15).</w:t>
             </w:r>
           </w:p>
         </w:tc>
@@ -1743,7 +1743,7 @@
               <w:rPr>
                 <w:sz w:val="19"/>
               </w:rPr>
-              <w:t>Una tarjeta destacada en la pantalla de terapias abre un curso breve de Cápsulas de Conocimiento (unos 2 minutos cada una) sobre cómo aprenden a hablar los niños, el porqué de las dinámicas de movimiento (TPR) y los vicios a evitar durante la terapia en casa (ver CU-16).</w:t>
+              <w:t>Una tarjeta destacada en la pantalla de terapias abre un curso breve de Cápsulas de Conocimiento (unos 2 minutos cada una) sobre cómo aprenden a hablar los niños, el porqué de las dinámicas de movimiento (TPR) y los vicios a evitar durante la terapia en casa (ver CU-03).</w:t>
             </w:r>
           </w:p>
         </w:tc>
@@ -2193,7 +2193,7 @@
               <w:rPr>
                 <w:sz w:val="19"/>
               </w:rPr>
-              <w:t>Durante el piloto, la app recoge métricas de usabilidad anónimas (tiempo por pantalla, toques fuera de zona útil y cápsulas de movimiento saltadas) y una encuesta breve de satisfacción. No incluyen nombres, ni audio, ni el contenido de las respuestas; se guardan cifradas en el dispositivo bajo un identificador de sesión y se purgan tras exportarlas (ver CU-13). Al tratarse de un estudio con menores, el consentimiento informado de las familias se gestiona en el protocolo del piloto, fuera de la app.</w:t>
+              <w:t>Durante el piloto, la app recoge métricas de usabilidad anónimas (tiempo por pantalla, toques fuera de zona útil y cápsulas de movimiento saltadas) y una encuesta breve de satisfacción. No incluyen nombres, ni audio, ni el contenido de las respuestas; se guardan cifradas en el dispositivo bajo un identificador de sesión y se purgan tras exportarlas (ver CU-14). Al tratarse de un estudio con menores, el consentimiento informado de las familias se gestiona en el protocolo del piloto, fuera de la app.</w:t>
             </w:r>
           </w:p>
         </w:tc>
@@ -3728,7 +3728,7 @@
         <w:rPr>
           <w:b w:val="0"/>
         </w:rPr>
-        <w:t xml:space="preserve"> se recordará para lanzar el Test de Ling antes de los ejercicios de audición (ver CU-07).</w:t>
+        <w:t xml:space="preserve"> se recordará para lanzar el Test de Ling antes de los ejercicios de audición (ver CU-08).</w:t>
       </w:r>
     </w:p>
     <w:tbl>
@@ -4150,7 +4150,7 @@
         <w:rPr>
           <w:b w:val="0"/>
         </w:rPr>
-        <w:t xml:space="preserve"> (CU-03), </w:t>
+        <w:t xml:space="preserve"> (CU-04), </w:t>
       </w:r>
       <w:r>
         <w:rPr>
@@ -4162,7 +4162,7 @@
         <w:rPr>
           <w:b w:val="0"/>
         </w:rPr>
-        <w:t xml:space="preserve"> (CU-04), </w:t>
+        <w:t xml:space="preserve"> (CU-05), </w:t>
       </w:r>
       <w:r>
         <w:rPr>
@@ -4186,7 +4186,7 @@
         <w:rPr>
           <w:b w:val="0"/>
         </w:rPr>
-        <w:t xml:space="preserve"> (CU-05 / CU-08).</w:t>
+        <w:t xml:space="preserve"> (CU-06 / CU-09).</w:t>
       </w:r>
     </w:p>
     <w:p>
@@ -4204,6 +4204,36 @@
         <w:rPr>
           <w:b w:val="0"/>
         </w:rPr>
+        <w:t xml:space="preserve">Antes de la primera sesión, abrir la tarjeta destacada </w:t>
+      </w:r>
+      <w:r>
+        <w:rPr>
+          <w:b/>
+        </w:rPr>
+        <w:t>“Academy”</w:t>
+      </w:r>
+      <w:r>
+        <w:rPr>
+          <w:b w:val="0"/>
+        </w:rPr>
+        <w:t xml:space="preserve"> para formarse como cuidador (ver CU-03): en la terapia auditivo-verbal el adulto dirige la sesión, así que conviene empezar por ahí.</w:t>
+      </w:r>
+    </w:p>
+    <w:p>
+      <w:pPr>
+        <w:spacing w:after="60"/>
+        <w:ind w:left="454" w:hanging="255"/>
+      </w:pPr>
+      <w:r>
+        <w:rPr>
+          <w:b/>
+        </w:rPr>
+        <w:t xml:space="preserve">3. </w:t>
+      </w:r>
+      <w:r>
+        <w:rPr>
+          <w:b w:val="0"/>
+        </w:rPr>
         <w:t xml:space="preserve">Desde la misma pantalla se activan los </w:t>
       </w:r>
       <w:r>
@@ -4216,8 +4246,55 @@
         <w:rPr>
           <w:b w:val="0"/>
         </w:rPr>
-        <w:t xml:space="preserve"> (ver CU-09).</w:t>
-      </w:r>
+        <w:t xml:space="preserve"> (ver CU-10).</w:t>
+      </w:r>
+    </w:p>
+    <w:tbl>
+      <w:tblPr>
+        <w:tblW w:type="auto" w:w="0"/>
+        <w:jc w:val="center"/>
+        <w:tblLook w:firstColumn="1" w:firstRow="1" w:lastColumn="0" w:lastRow="0" w:noHBand="0" w:noVBand="1" w:val="04A0"/>
+      </w:tblPr>
+      <w:tblGrid>
+        <w:gridCol w:w="9638"/>
+      </w:tblGrid>
+      <w:tr>
+        <w:tc>
+          <w:tcPr>
+            <w:tcW w:type="dxa" w:w="9638"/>
+            <w:shd w:val="clear" w:fill="F5F0FF"/>
+          </w:tcPr>
+          <w:p>
+            <w:pPr>
+              <w:spacing w:after="40"/>
+            </w:pPr>
+            <w:r>
+              <w:rPr>
+                <w:b/>
+                <w:color w:val="6D3FC4"/>
+                <w:sz w:val="17"/>
+              </w:rPr>
+              <w:t>EMPIEZA POR ACADEMY</w:t>
+            </w:r>
+          </w:p>
+          <w:p>
+            <w:pPr>
+              <w:spacing w:after="40"/>
+            </w:pPr>
+            <w:r>
+              <w:rPr>
+                <w:sz w:val="19"/>
+              </w:rPr>
+              <w:t>La tarjeta Academy (CU-03) comparte jerarquía visual con los bloques de terapia y no depende de nada previo: es el primer paso recomendado para que el adulto acompañe con criterio.</w:t>
+            </w:r>
+          </w:p>
+        </w:tc>
+      </w:tr>
+    </w:tbl>
+    <w:p>
+      <w:pPr>
+        <w:spacing w:after="40"/>
+      </w:pPr>
     </w:p>
     <w:tbl>
       <w:tblPr>
@@ -4266,6 +4343,633 @@
         <w:spacing w:after="40"/>
       </w:pPr>
     </w:p>
+    <w:p>
+      <w:r>
+        <w:br w:type="page"/>
+      </w:r>
+    </w:p>
+    <w:tbl>
+      <w:tblPr>
+        <w:tblW w:type="auto" w:w="0"/>
+        <w:jc w:val="center"/>
+        <w:tblLook w:firstColumn="1" w:firstRow="1" w:lastColumn="0" w:lastRow="0" w:noHBand="0" w:noVBand="1" w:val="04A0"/>
+      </w:tblPr>
+      <w:tblGrid>
+        <w:gridCol w:w="9638"/>
+      </w:tblGrid>
+      <w:tr>
+        <w:tc>
+          <w:tcPr>
+            <w:tcW w:type="dxa" w:w="9638"/>
+            <w:shd w:val="clear" w:fill="00C4BE"/>
+          </w:tcPr>
+          <w:p>
+            <w:pPr>
+              <w:spacing w:before="80"/>
+            </w:pPr>
+            <w:r>
+              <w:rPr>
+                <w:b/>
+                <w:color w:val="F0FDF9"/>
+                <w:sz w:val="17"/>
+              </w:rPr>
+              <w:t>CU-03 · Familia</w:t>
+            </w:r>
+          </w:p>
+          <w:p>
+            <w:pPr>
+              <w:spacing w:after="80"/>
+            </w:pPr>
+            <w:r>
+              <w:rPr>
+                <w:b/>
+                <w:color w:val="FFFFFF"/>
+                <w:sz w:val="28"/>
+              </w:rPr>
+              <w:t>Academy: formarse con las Cápsulas de Conocimiento</w:t>
+            </w:r>
+          </w:p>
+        </w:tc>
+      </w:tr>
+    </w:tbl>
+    <w:tbl>
+      <w:tblPr>
+        <w:tblW w:type="auto" w:w="0"/>
+        <w:jc w:val="center"/>
+        <w:tblLook w:firstColumn="1" w:firstRow="1" w:lastColumn="0" w:lastRow="0" w:noHBand="0" w:noVBand="1" w:val="04A0"/>
+      </w:tblPr>
+      <w:tblGrid>
+        <w:gridCol w:w="4819"/>
+        <w:gridCol w:w="4819"/>
+      </w:tblGrid>
+      <w:tr>
+        <w:tc>
+          <w:tcPr>
+            <w:tcW w:type="dxa" w:w="4819"/>
+          </w:tcPr>
+          <w:p>
+            <w:r>
+              <w:rPr>
+                <w:b/>
+                <w:color w:val="6B7280"/>
+                <w:sz w:val="15"/>
+              </w:rPr>
+              <w:t>ACTOR</w:t>
+            </w:r>
+          </w:p>
+          <w:p>
+            <w:r>
+              <w:rPr>
+                <w:b/>
+                <w:sz w:val="19"/>
+              </w:rPr>
+              <w:t>Adulto que dirige la sesión (familia o cuidador)</w:t>
+            </w:r>
+          </w:p>
+        </w:tc>
+        <w:tc>
+          <w:tcPr>
+            <w:tcW w:type="dxa" w:w="4819"/>
+          </w:tcPr>
+          <w:p>
+            <w:r>
+              <w:rPr>
+                <w:b/>
+                <w:color w:val="6B7280"/>
+                <w:sz w:val="15"/>
+              </w:rPr>
+              <w:t>PANTALLA</w:t>
+            </w:r>
+          </w:p>
+          <w:p>
+            <w:r>
+              <w:rPr>
+                <w:b/>
+                <w:sz w:val="19"/>
+              </w:rPr>
+              <w:t>Prescripción de Terapias → Academy</w:t>
+            </w:r>
+          </w:p>
+        </w:tc>
+      </w:tr>
+      <w:tr>
+        <w:tc>
+          <w:tcPr>
+            <w:tcW w:type="dxa" w:w="4819"/>
+          </w:tcPr>
+          <w:p>
+            <w:r>
+              <w:rPr>
+                <w:b/>
+                <w:color w:val="6B7280"/>
+                <w:sz w:val="15"/>
+              </w:rPr>
+              <w:t>PRECONDICIÓN</w:t>
+            </w:r>
+          </w:p>
+          <w:p>
+            <w:r>
+              <w:rPr>
+                <w:b/>
+                <w:sz w:val="19"/>
+              </w:rPr>
+              <w:t>Ninguna; disponible desde el primer día</w:t>
+            </w:r>
+          </w:p>
+        </w:tc>
+        <w:tc>
+          <w:tcPr>
+            <w:tcW w:type="dxa" w:w="4819"/>
+          </w:tcPr>
+          <w:p>
+            <w:r>
+              <w:rPr>
+                <w:b/>
+                <w:color w:val="6B7280"/>
+                <w:sz w:val="15"/>
+              </w:rPr>
+              <w:t>RESULTADO</w:t>
+            </w:r>
+          </w:p>
+          <w:p>
+            <w:r>
+              <w:rPr>
+                <w:b/>
+                <w:sz w:val="19"/>
+              </w:rPr>
+              <w:t>Cápsula completada y progreso guardado</w:t>
+            </w:r>
+          </w:p>
+        </w:tc>
+      </w:tr>
+    </w:tbl>
+    <w:p>
+      <w:pPr>
+        <w:spacing w:after="40"/>
+      </w:pPr>
+    </w:p>
+    <w:p>
+      <w:pPr>
+        <w:spacing w:after="120"/>
+      </w:pPr>
+      <w:r>
+        <w:rPr>
+          <w:b w:val="0"/>
+          <w:i w:val="0"/>
+        </w:rPr>
+        <w:t>Academy es el espacio de formación para el adulto. En la terapia auditivo-verbal la persona que acompaña al niño es el motor de la sesión, así que Academy le enseña —en pequeñas dosis— a hacerlo mejor. Aparece como una tarjeta destacada “Academy” en la pantalla de terapias, con una barra de progreso siempre a la vista.</w:t>
+      </w:r>
+    </w:p>
+    <w:tbl>
+      <w:tblPr>
+        <w:tblStyle w:val="TableGrid"/>
+        <w:tblW w:type="auto" w:w="0"/>
+        <w:jc w:val="center"/>
+        <w:tblLook w:firstColumn="1" w:firstRow="1" w:lastColumn="0" w:lastRow="0" w:noHBand="0" w:noVBand="1" w:val="04A0"/>
+      </w:tblPr>
+      <w:tblGrid>
+        <w:gridCol w:w="4819"/>
+        <w:gridCol w:w="4819"/>
+      </w:tblGrid>
+      <w:tr>
+        <w:tc>
+          <w:tcPr>
+            <w:tcW w:type="dxa" w:w="2721"/>
+            <w:shd w:val="clear" w:fill="E6F9F8"/>
+          </w:tcPr>
+          <w:p>
+            <w:r>
+              <w:rPr>
+                <w:b/>
+                <w:color w:val="00A39E"/>
+                <w:sz w:val="18"/>
+              </w:rPr>
+              <w:t>Tema</w:t>
+            </w:r>
+          </w:p>
+        </w:tc>
+        <w:tc>
+          <w:tcPr>
+            <w:tcW w:type="dxa" w:w="6917"/>
+            <w:shd w:val="clear" w:fill="E6F9F8"/>
+          </w:tcPr>
+          <w:p>
+            <w:r>
+              <w:rPr>
+                <w:b/>
+                <w:color w:val="00A39E"/>
+                <w:sz w:val="18"/>
+              </w:rPr>
+              <w:t>Qué se aprende</w:t>
+            </w:r>
+          </w:p>
+        </w:tc>
+      </w:tr>
+      <w:tr>
+        <w:tc>
+          <w:tcPr>
+            <w:tcW w:type="dxa" w:w="2721"/>
+          </w:tcPr>
+          <w:p>
+            <w:r>
+              <w:rPr>
+                <w:b/>
+                <w:sz w:val="19"/>
+              </w:rPr>
+              <w:t>👂 Cómo aprenden a hablar</w:t>
+            </w:r>
+          </w:p>
+        </w:tc>
+        <w:tc>
+          <w:tcPr>
+            <w:tcW w:type="dxa" w:w="6917"/>
+          </w:tcPr>
+          <w:p>
+            <w:r>
+              <w:rPr>
+                <w:sz w:val="19"/>
+              </w:rPr>
+              <w:t>Que el niño escucha mucho antes de hablar y que la conversación por turnos —y saber esperar en silencio— es lo que impulsa el lenguaje.</w:t>
+            </w:r>
+          </w:p>
+        </w:tc>
+      </w:tr>
+      <w:tr>
+        <w:tc>
+          <w:tcPr>
+            <w:tcW w:type="dxa" w:w="2721"/>
+          </w:tcPr>
+          <w:p>
+            <w:r>
+              <w:rPr>
+                <w:b/>
+                <w:sz w:val="19"/>
+              </w:rPr>
+              <w:t>🤸 Por qué moverse (TPR)</w:t>
+            </w:r>
+          </w:p>
+        </w:tc>
+        <w:tc>
+          <w:tcPr>
+            <w:tcW w:type="dxa" w:w="6917"/>
+          </w:tcPr>
+          <w:p>
+            <w:r>
+              <w:rPr>
+                <w:sz w:val="19"/>
+              </w:rPr>
+              <w:t>Unir sonido y movimiento ayuda a recordar y quita la presión de “tener que hablar”; por eso es el adulto quien confirma si el niño cumplió la orden.</w:t>
+            </w:r>
+          </w:p>
+        </w:tc>
+      </w:tr>
+      <w:tr>
+        <w:tc>
+          <w:tcPr>
+            <w:tcW w:type="dxa" w:w="2721"/>
+          </w:tcPr>
+          <w:p>
+            <w:r>
+              <w:rPr>
+                <w:b/>
+                <w:sz w:val="19"/>
+              </w:rPr>
+              <w:t>🚫 Vicios a evitar</w:t>
+            </w:r>
+          </w:p>
+        </w:tc>
+        <w:tc>
+          <w:tcPr>
+            <w:tcW w:type="dxa" w:w="6917"/>
+          </w:tcPr>
+          <w:p>
+            <w:r>
+              <w:rPr>
+                <w:sz w:val="19"/>
+              </w:rPr>
+              <w:t>No decir “así no se dice” sino repetir bien la palabra dentro de la frase; y comentar más que preguntar para que la sesión no parezca un examen.</w:t>
+            </w:r>
+          </w:p>
+        </w:tc>
+      </w:tr>
+      <w:tr>
+        <w:tc>
+          <w:tcPr>
+            <w:tcW w:type="dxa" w:w="2721"/>
+          </w:tcPr>
+          <w:p>
+            <w:r>
+              <w:rPr>
+                <w:b/>
+                <w:sz w:val="19"/>
+              </w:rPr>
+              <w:t>🧑‍🏫 Terapia mediada</w:t>
+            </w:r>
+          </w:p>
+        </w:tc>
+        <w:tc>
+          <w:tcPr>
+            <w:tcW w:type="dxa" w:w="6917"/>
+          </w:tcPr>
+          <w:p>
+            <w:r>
+              <w:rPr>
+                <w:sz w:val="19"/>
+              </w:rPr>
+              <w:t>La app es la herramienta; el terapeuta en casa es el adulto, que puede parar cuando haga falta: no hay un mínimo que cumplir.</w:t>
+            </w:r>
+          </w:p>
+        </w:tc>
+      </w:tr>
+    </w:tbl>
+    <w:p>
+      <w:pPr>
+        <w:spacing w:after="40"/>
+      </w:pPr>
+    </w:p>
+    <w:p>
+      <w:pPr>
+        <w:keepNext/>
+        <w:spacing w:after="60" w:before="160"/>
+      </w:pPr>
+      <w:r>
+        <w:rPr>
+          <w:b/>
+          <w:i w:val="0"/>
+          <w:color w:val="4B5563"/>
+          <w:sz w:val="21"/>
+        </w:rPr>
+        <w:t>Flujo principal</w:t>
+      </w:r>
+    </w:p>
+    <w:p>
+      <w:pPr>
+        <w:spacing w:after="60"/>
+        <w:ind w:left="454" w:hanging="255"/>
+      </w:pPr>
+      <w:r>
+        <w:rPr>
+          <w:b/>
+        </w:rPr>
+        <w:t xml:space="preserve">1. </w:t>
+      </w:r>
+      <w:r>
+        <w:rPr>
+          <w:b w:val="0"/>
+        </w:rPr>
+        <w:t xml:space="preserve">En </w:t>
+      </w:r>
+      <w:r>
+        <w:rPr>
+          <w:b/>
+        </w:rPr>
+        <w:t>Prescripción de Terapias</w:t>
+      </w:r>
+      <w:r>
+        <w:rPr>
+          <w:b w:val="0"/>
+        </w:rPr>
+        <w:t xml:space="preserve">, pulsar la tarjeta </w:t>
+      </w:r>
+      <w:r>
+        <w:rPr>
+          <w:b/>
+        </w:rPr>
+        <w:t>“Academy”</w:t>
+      </w:r>
+      <w:r>
+        <w:rPr>
+          <w:b w:val="0"/>
+        </w:rPr>
+        <w:t xml:space="preserve"> (bajo el rótulo “Tu formación”).</w:t>
+      </w:r>
+    </w:p>
+    <w:p>
+      <w:pPr>
+        <w:spacing w:after="60"/>
+        <w:ind w:left="454" w:hanging="255"/>
+      </w:pPr>
+      <w:r>
+        <w:rPr>
+          <w:b/>
+        </w:rPr>
+        <w:t xml:space="preserve">2. </w:t>
+      </w:r>
+      <w:r>
+        <w:rPr>
+          <w:b w:val="0"/>
+        </w:rPr>
+        <w:t xml:space="preserve">Elegir una </w:t>
+      </w:r>
+      <w:r>
+        <w:rPr>
+          <w:b/>
+        </w:rPr>
+        <w:t>Cápsula de Conocimiento</w:t>
+      </w:r>
+      <w:r>
+        <w:rPr>
+          <w:b w:val="0"/>
+        </w:rPr>
+        <w:t xml:space="preserve"> de la lista (unos 2 minutos cada una).</w:t>
+      </w:r>
+    </w:p>
+    <w:p>
+      <w:pPr>
+        <w:spacing w:after="60"/>
+        <w:ind w:left="454" w:hanging="255"/>
+      </w:pPr>
+      <w:r>
+        <w:rPr>
+          <w:b/>
+        </w:rPr>
+        <w:t xml:space="preserve">3. </w:t>
+      </w:r>
+      <w:r>
+        <w:rPr>
+          <w:b w:val="0"/>
+        </w:rPr>
+        <w:t xml:space="preserve">Leer las </w:t>
+      </w:r>
+      <w:r>
+        <w:rPr>
+          <w:b/>
+        </w:rPr>
+        <w:t>diapositivas</w:t>
+      </w:r>
+      <w:r>
+        <w:rPr>
+          <w:b w:val="0"/>
+        </w:rPr>
+        <w:t xml:space="preserve"> avanzando con “Siguiente”.</w:t>
+      </w:r>
+    </w:p>
+    <w:p>
+      <w:pPr>
+        <w:spacing w:after="60"/>
+        <w:ind w:left="454" w:hanging="255"/>
+      </w:pPr>
+      <w:r>
+        <w:rPr>
+          <w:b/>
+        </w:rPr>
+        <w:t xml:space="preserve">4. </w:t>
+      </w:r>
+      <w:r>
+        <w:rPr>
+          <w:b w:val="0"/>
+        </w:rPr>
+        <w:t xml:space="preserve">Responder el </w:t>
+      </w:r>
+      <w:r>
+        <w:rPr>
+          <w:b/>
+        </w:rPr>
+        <w:t>quiz rápido</w:t>
+      </w:r>
+      <w:r>
+        <w:rPr>
+          <w:b w:val="0"/>
+        </w:rPr>
+        <w:t xml:space="preserve"> del final; cada respuesta muestra una breve explicación.</w:t>
+      </w:r>
+    </w:p>
+    <w:p>
+      <w:pPr>
+        <w:spacing w:after="60"/>
+        <w:ind w:left="454" w:hanging="255"/>
+      </w:pPr>
+      <w:r>
+        <w:rPr>
+          <w:b/>
+        </w:rPr>
+        <w:t xml:space="preserve">5. </w:t>
+      </w:r>
+      <w:r>
+        <w:rPr>
+          <w:b w:val="0"/>
+        </w:rPr>
+        <w:t xml:space="preserve">Al aprobar, la app suma </w:t>
+      </w:r>
+      <w:r>
+        <w:rPr>
+          <w:b/>
+        </w:rPr>
+        <w:t>puntos e insignias</w:t>
+      </w:r>
+      <w:r>
+        <w:rPr>
+          <w:b w:val="0"/>
+        </w:rPr>
+        <w:t xml:space="preserve"> y la </w:t>
+      </w:r>
+      <w:r>
+        <w:rPr>
+          <w:b/>
+        </w:rPr>
+        <w:t>barra de la tarjeta avanza al instante</w:t>
+      </w:r>
+      <w:r>
+        <w:rPr>
+          <w:b w:val="0"/>
+        </w:rPr>
+        <w:t>.</w:t>
+      </w:r>
+    </w:p>
+    <w:tbl>
+      <w:tblPr>
+        <w:tblW w:type="auto" w:w="0"/>
+        <w:jc w:val="center"/>
+        <w:tblLook w:firstColumn="1" w:firstRow="1" w:lastColumn="0" w:lastRow="0" w:noHBand="0" w:noVBand="1" w:val="04A0"/>
+      </w:tblPr>
+      <w:tblGrid>
+        <w:gridCol w:w="9638"/>
+      </w:tblGrid>
+      <w:tr>
+        <w:tc>
+          <w:tcPr>
+            <w:tcW w:type="dxa" w:w="9638"/>
+            <w:shd w:val="clear" w:fill="F0FDF9"/>
+          </w:tcPr>
+          <w:p>
+            <w:pPr>
+              <w:spacing w:after="40"/>
+            </w:pPr>
+            <w:r>
+              <w:rPr>
+                <w:b/>
+                <w:color w:val="00A39E"/>
+                <w:sz w:val="17"/>
+              </w:rPr>
+              <w:t>ES PARA EL ADULTO, NO PARA EL NIÑO</w:t>
+            </w:r>
+          </w:p>
+          <w:p>
+            <w:pPr>
+              <w:spacing w:after="40"/>
+            </w:pPr>
+            <w:r>
+              <w:rPr>
+                <w:sz w:val="19"/>
+              </w:rPr>
+              <w:t>Academy vive junto a los menús de la app, que maneja siempre el adulto; la tableta se cede al niño solo cuando el ejercicio ya ha empezado. Por eso el niño no llega por error a esta formación.</w:t>
+            </w:r>
+          </w:p>
+        </w:tc>
+      </w:tr>
+    </w:tbl>
+    <w:p>
+      <w:pPr>
+        <w:spacing w:after="40"/>
+      </w:pPr>
+    </w:p>
+    <w:tbl>
+      <w:tblPr>
+        <w:tblW w:type="auto" w:w="0"/>
+        <w:jc w:val="center"/>
+        <w:tblLook w:firstColumn="1" w:firstRow="1" w:lastColumn="0" w:lastRow="0" w:noHBand="0" w:noVBand="1" w:val="04A0"/>
+      </w:tblPr>
+      <w:tblGrid>
+        <w:gridCol w:w="9638"/>
+      </w:tblGrid>
+      <w:tr>
+        <w:tc>
+          <w:tcPr>
+            <w:tcW w:type="dxa" w:w="9638"/>
+            <w:shd w:val="clear" w:fill="F0FDF9"/>
+          </w:tcPr>
+          <w:p>
+            <w:pPr>
+              <w:spacing w:after="40"/>
+            </w:pPr>
+            <w:r>
+              <w:rPr>
+                <w:b/>
+                <w:color w:val="00A39E"/>
+                <w:sz w:val="17"/>
+              </w:rPr>
+              <w:t>EL PROGRESO NO SE PIERDE</w:t>
+            </w:r>
+          </w:p>
+          <w:p>
+            <w:pPr>
+              <w:spacing w:after="40"/>
+            </w:pPr>
+            <w:r>
+              <w:rPr>
+                <w:sz w:val="19"/>
+              </w:rPr>
+              <w:t>El avance (cápsulas hechas, nivel e insignias) se guarda cifrado en el dispositivo, igual que el resto de datos, y funciona sin conexión.</w:t>
+            </w:r>
+          </w:p>
+        </w:tc>
+      </w:tr>
+    </w:tbl>
+    <w:p>
+      <w:pPr>
+        <w:spacing w:after="40"/>
+      </w:pPr>
+    </w:p>
     <w:tbl>
       <w:tblPr>
         <w:tblW w:type="auto" w:w="0"/>
@@ -4291,7 +4995,7 @@
                 <w:color w:val="F0FDF9"/>
                 <w:sz w:val="17"/>
               </w:rPr>
-              <w:t>CU-03 · Familia</w:t>
+              <w:t>CU-04 · Familia</w:t>
             </w:r>
           </w:p>
           <w:p>
@@ -5073,7 +5777,7 @@
                 <w:color w:val="F0FDF9"/>
                 <w:sz w:val="17"/>
               </w:rPr>
-              <w:t>CU-04 · Familia</w:t>
+              <w:t>CU-05 · Familia</w:t>
             </w:r>
           </w:p>
           <w:p>
@@ -5810,7 +6514,7 @@
                 <w:color w:val="F0FDF9"/>
                 <w:sz w:val="17"/>
               </w:rPr>
-              <w:t>CU-05 · Profesional</w:t>
+              <w:t>CU-06 · Profesional</w:t>
             </w:r>
           </w:p>
           <w:p>
@@ -6362,7 +7066,7 @@
                 <w:color w:val="F0FDF9"/>
                 <w:sz w:val="17"/>
               </w:rPr>
-              <w:t>CU-06 · Familia</w:t>
+              <w:t>CU-07 · Familia</w:t>
             </w:r>
           </w:p>
           <w:p>
@@ -6748,7 +7452,7 @@
                 <w:color w:val="F0FDF9"/>
                 <w:sz w:val="17"/>
               </w:rPr>
-              <w:t>CU-07 · Familia</w:t>
+              <w:t>CU-08 · Familia</w:t>
             </w:r>
           </w:p>
           <w:p>
@@ -7323,7 +8027,7 @@
                 <w:color w:val="F0FDF9"/>
                 <w:sz w:val="17"/>
               </w:rPr>
-              <w:t>CU-08 · Familia</w:t>
+              <w:t>CU-09 · Familia</w:t>
             </w:r>
           </w:p>
           <w:p>
@@ -7656,7 +8360,7 @@
         <w:rPr>
           <w:b w:val="0"/>
         </w:rPr>
-        <w:t xml:space="preserve"> (XP, racha, nivel, insignias). Ver CU-10.</w:t>
+        <w:t xml:space="preserve"> (XP, racha, nivel, insignias). Ver CU-11.</w:t>
       </w:r>
     </w:p>
     <w:p>
@@ -7990,7 +8694,7 @@
                 <w:color w:val="F0FDF9"/>
                 <w:sz w:val="17"/>
               </w:rPr>
-              <w:t>CU-09 · Familia</w:t>
+              <w:t>CU-10 · Familia</w:t>
             </w:r>
           </w:p>
           <w:p>
@@ -8294,7 +8998,7 @@
                 <w:color w:val="F0FDF9"/>
                 <w:sz w:val="17"/>
               </w:rPr>
-              <w:t>CU-10 · Familia</w:t>
+              <w:t>CU-11 · Familia</w:t>
             </w:r>
           </w:p>
           <w:p>
@@ -8555,7 +9259,7 @@
               <w:rPr>
                 <w:sz w:val="19"/>
               </w:rPr>
-              <w:t>La racha se mantiene mientras se practique hoy o ayer. Si se salta más de un día, vuelve a cero: por eso ayudan los recordatorios de CU-09.</w:t>
+              <w:t>La racha se mantiene mientras se practique hoy o ayer. Si se salta más de un día, vuelve a cero: por eso ayudan los recordatorios de CU-10.</w:t>
             </w:r>
           </w:p>
         </w:tc>
@@ -8591,7 +9295,7 @@
                 <w:color w:val="F0FDF9"/>
                 <w:sz w:val="17"/>
               </w:rPr>
-              <w:t>CU-11 · Profesional / Familia</w:t>
+              <w:t>CU-12 · Profesional / Familia</w:t>
             </w:r>
           </w:p>
           <w:p>
@@ -8879,7 +9583,7 @@
         <w:t xml:space="preserve">4. </w:t>
       </w:r>
       <w:r>
-        <w:t>El logopeda usa estos datos para ajustar la prescripción (volver a CU-05) en la siguiente revisión.</w:t>
+        <w:t>El logopeda usa estos datos para ajustar la prescripción (volver a CU-06) en la siguiente revisión.</w:t>
       </w:r>
     </w:p>
     <w:tbl>
@@ -9112,7 +9816,7 @@
                 <w:color w:val="F0FDF9"/>
                 <w:sz w:val="17"/>
               </w:rPr>
-              <w:t>CU-12 · Profesional</w:t>
+              <w:t>CU-13 · Profesional</w:t>
             </w:r>
           </w:p>
           <w:p>
@@ -9426,7 +10130,7 @@
                 <w:color w:val="F0FDF9"/>
                 <w:sz w:val="17"/>
               </w:rPr>
-              <w:t>CU-13 · Profesional</w:t>
+              <w:t>CU-14 · Profesional</w:t>
             </w:r>
           </w:p>
           <w:p>
@@ -10160,7 +10864,7 @@
                 <w:color w:val="F0FDF9"/>
                 <w:sz w:val="17"/>
               </w:rPr>
-              <w:t>CU-14 · Profesional / Familia</w:t>
+              <w:t>CU-15 · Profesional / Familia</w:t>
             </w:r>
           </w:p>
           <w:p>
@@ -10852,7 +11556,7 @@
                 <w:color w:val="F0FDF9"/>
                 <w:sz w:val="17"/>
               </w:rPr>
-              <w:t>CU-15 · Profesional</w:t>
+              <w:t>CU-16 · Profesional</w:t>
             </w:r>
           </w:p>
           <w:p>
@@ -11515,633 +12219,6 @@
         <w:br w:type="page"/>
       </w:r>
     </w:p>
-    <w:tbl>
-      <w:tblPr>
-        <w:tblW w:type="auto" w:w="0"/>
-        <w:jc w:val="center"/>
-        <w:tblLook w:firstColumn="1" w:firstRow="1" w:lastColumn="0" w:lastRow="0" w:noHBand="0" w:noVBand="1" w:val="04A0"/>
-      </w:tblPr>
-      <w:tblGrid>
-        <w:gridCol w:w="9638"/>
-      </w:tblGrid>
-      <w:tr>
-        <w:tc>
-          <w:tcPr>
-            <w:tcW w:type="dxa" w:w="9638"/>
-            <w:shd w:val="clear" w:fill="00C4BE"/>
-          </w:tcPr>
-          <w:p>
-            <w:pPr>
-              <w:spacing w:before="80"/>
-            </w:pPr>
-            <w:r>
-              <w:rPr>
-                <w:b/>
-                <w:color w:val="F0FDF9"/>
-                <w:sz w:val="17"/>
-              </w:rPr>
-              <w:t>CU-16 · Familia</w:t>
-            </w:r>
-          </w:p>
-          <w:p>
-            <w:pPr>
-              <w:spacing w:after="80"/>
-            </w:pPr>
-            <w:r>
-              <w:rPr>
-                <w:b/>
-                <w:color w:val="FFFFFF"/>
-                <w:sz w:val="28"/>
-              </w:rPr>
-              <w:t>Academy: formarse con las Cápsulas de Conocimiento</w:t>
-            </w:r>
-          </w:p>
-        </w:tc>
-      </w:tr>
-    </w:tbl>
-    <w:tbl>
-      <w:tblPr>
-        <w:tblW w:type="auto" w:w="0"/>
-        <w:jc w:val="center"/>
-        <w:tblLook w:firstColumn="1" w:firstRow="1" w:lastColumn="0" w:lastRow="0" w:noHBand="0" w:noVBand="1" w:val="04A0"/>
-      </w:tblPr>
-      <w:tblGrid>
-        <w:gridCol w:w="4819"/>
-        <w:gridCol w:w="4819"/>
-      </w:tblGrid>
-      <w:tr>
-        <w:tc>
-          <w:tcPr>
-            <w:tcW w:type="dxa" w:w="4819"/>
-          </w:tcPr>
-          <w:p>
-            <w:r>
-              <w:rPr>
-                <w:b/>
-                <w:color w:val="6B7280"/>
-                <w:sz w:val="15"/>
-              </w:rPr>
-              <w:t>ACTOR</w:t>
-            </w:r>
-          </w:p>
-          <w:p>
-            <w:r>
-              <w:rPr>
-                <w:b/>
-                <w:sz w:val="19"/>
-              </w:rPr>
-              <w:t>Adulto que dirige la sesión (familia o cuidador)</w:t>
-            </w:r>
-          </w:p>
-        </w:tc>
-        <w:tc>
-          <w:tcPr>
-            <w:tcW w:type="dxa" w:w="4819"/>
-          </w:tcPr>
-          <w:p>
-            <w:r>
-              <w:rPr>
-                <w:b/>
-                <w:color w:val="6B7280"/>
-                <w:sz w:val="15"/>
-              </w:rPr>
-              <w:t>PANTALLA</w:t>
-            </w:r>
-          </w:p>
-          <w:p>
-            <w:r>
-              <w:rPr>
-                <w:b/>
-                <w:sz w:val="19"/>
-              </w:rPr>
-              <w:t>Prescripción de Terapias → Academy</w:t>
-            </w:r>
-          </w:p>
-        </w:tc>
-      </w:tr>
-      <w:tr>
-        <w:tc>
-          <w:tcPr>
-            <w:tcW w:type="dxa" w:w="4819"/>
-          </w:tcPr>
-          <w:p>
-            <w:r>
-              <w:rPr>
-                <w:b/>
-                <w:color w:val="6B7280"/>
-                <w:sz w:val="15"/>
-              </w:rPr>
-              <w:t>PRECONDICIÓN</w:t>
-            </w:r>
-          </w:p>
-          <w:p>
-            <w:r>
-              <w:rPr>
-                <w:b/>
-                <w:sz w:val="19"/>
-              </w:rPr>
-              <w:t>Ninguna; disponible desde el primer día</w:t>
-            </w:r>
-          </w:p>
-        </w:tc>
-        <w:tc>
-          <w:tcPr>
-            <w:tcW w:type="dxa" w:w="4819"/>
-          </w:tcPr>
-          <w:p>
-            <w:r>
-              <w:rPr>
-                <w:b/>
-                <w:color w:val="6B7280"/>
-                <w:sz w:val="15"/>
-              </w:rPr>
-              <w:t>RESULTADO</w:t>
-            </w:r>
-          </w:p>
-          <w:p>
-            <w:r>
-              <w:rPr>
-                <w:b/>
-                <w:sz w:val="19"/>
-              </w:rPr>
-              <w:t>Cápsula completada y progreso guardado</w:t>
-            </w:r>
-          </w:p>
-        </w:tc>
-      </w:tr>
-    </w:tbl>
-    <w:p>
-      <w:pPr>
-        <w:spacing w:after="40"/>
-      </w:pPr>
-    </w:p>
-    <w:p>
-      <w:pPr>
-        <w:spacing w:after="120"/>
-      </w:pPr>
-      <w:r>
-        <w:rPr>
-          <w:b w:val="0"/>
-          <w:i w:val="0"/>
-        </w:rPr>
-        <w:t>Academy es el espacio de formación para el adulto. En la terapia auditivo-verbal la persona que acompaña al niño es el motor de la sesión, así que Academy le enseña —en pequeñas dosis— a hacerlo mejor. Aparece como una tarjeta destacada “Academy” en la pantalla de terapias, con una barra de progreso siempre a la vista.</w:t>
-      </w:r>
-    </w:p>
-    <w:tbl>
-      <w:tblPr>
-        <w:tblStyle w:val="TableGrid"/>
-        <w:tblW w:type="auto" w:w="0"/>
-        <w:jc w:val="center"/>
-        <w:tblLook w:firstColumn="1" w:firstRow="1" w:lastColumn="0" w:lastRow="0" w:noHBand="0" w:noVBand="1" w:val="04A0"/>
-      </w:tblPr>
-      <w:tblGrid>
-        <w:gridCol w:w="4819"/>
-        <w:gridCol w:w="4819"/>
-      </w:tblGrid>
-      <w:tr>
-        <w:tc>
-          <w:tcPr>
-            <w:tcW w:type="dxa" w:w="2721"/>
-            <w:shd w:val="clear" w:fill="E6F9F8"/>
-          </w:tcPr>
-          <w:p>
-            <w:r>
-              <w:rPr>
-                <w:b/>
-                <w:color w:val="00A39E"/>
-                <w:sz w:val="18"/>
-              </w:rPr>
-              <w:t>Tema</w:t>
-            </w:r>
-          </w:p>
-        </w:tc>
-        <w:tc>
-          <w:tcPr>
-            <w:tcW w:type="dxa" w:w="6917"/>
-            <w:shd w:val="clear" w:fill="E6F9F8"/>
-          </w:tcPr>
-          <w:p>
-            <w:r>
-              <w:rPr>
-                <w:b/>
-                <w:color w:val="00A39E"/>
-                <w:sz w:val="18"/>
-              </w:rPr>
-              <w:t>Qué se aprende</w:t>
-            </w:r>
-          </w:p>
-        </w:tc>
-      </w:tr>
-      <w:tr>
-        <w:tc>
-          <w:tcPr>
-            <w:tcW w:type="dxa" w:w="2721"/>
-          </w:tcPr>
-          <w:p>
-            <w:r>
-              <w:rPr>
-                <w:b/>
-                <w:sz w:val="19"/>
-              </w:rPr>
-              <w:t>👂 Cómo aprenden a hablar</w:t>
-            </w:r>
-          </w:p>
-        </w:tc>
-        <w:tc>
-          <w:tcPr>
-            <w:tcW w:type="dxa" w:w="6917"/>
-          </w:tcPr>
-          <w:p>
-            <w:r>
-              <w:rPr>
-                <w:sz w:val="19"/>
-              </w:rPr>
-              <w:t>Que el niño escucha mucho antes de hablar y que la conversación por turnos —y saber esperar en silencio— es lo que impulsa el lenguaje.</w:t>
-            </w:r>
-          </w:p>
-        </w:tc>
-      </w:tr>
-      <w:tr>
-        <w:tc>
-          <w:tcPr>
-            <w:tcW w:type="dxa" w:w="2721"/>
-          </w:tcPr>
-          <w:p>
-            <w:r>
-              <w:rPr>
-                <w:b/>
-                <w:sz w:val="19"/>
-              </w:rPr>
-              <w:t>🤸 Por qué moverse (TPR)</w:t>
-            </w:r>
-          </w:p>
-        </w:tc>
-        <w:tc>
-          <w:tcPr>
-            <w:tcW w:type="dxa" w:w="6917"/>
-          </w:tcPr>
-          <w:p>
-            <w:r>
-              <w:rPr>
-                <w:sz w:val="19"/>
-              </w:rPr>
-              <w:t>Unir sonido y movimiento ayuda a recordar y quita la presión de “tener que hablar”; por eso es el adulto quien confirma si el niño cumplió la orden.</w:t>
-            </w:r>
-          </w:p>
-        </w:tc>
-      </w:tr>
-      <w:tr>
-        <w:tc>
-          <w:tcPr>
-            <w:tcW w:type="dxa" w:w="2721"/>
-          </w:tcPr>
-          <w:p>
-            <w:r>
-              <w:rPr>
-                <w:b/>
-                <w:sz w:val="19"/>
-              </w:rPr>
-              <w:t>🚫 Vicios a evitar</w:t>
-            </w:r>
-          </w:p>
-        </w:tc>
-        <w:tc>
-          <w:tcPr>
-            <w:tcW w:type="dxa" w:w="6917"/>
-          </w:tcPr>
-          <w:p>
-            <w:r>
-              <w:rPr>
-                <w:sz w:val="19"/>
-              </w:rPr>
-              <w:t>No decir “así no se dice” sino repetir bien la palabra dentro de la frase; y comentar más que preguntar para que la sesión no parezca un examen.</w:t>
-            </w:r>
-          </w:p>
-        </w:tc>
-      </w:tr>
-      <w:tr>
-        <w:tc>
-          <w:tcPr>
-            <w:tcW w:type="dxa" w:w="2721"/>
-          </w:tcPr>
-          <w:p>
-            <w:r>
-              <w:rPr>
-                <w:b/>
-                <w:sz w:val="19"/>
-              </w:rPr>
-              <w:t>🧑‍🏫 Terapia mediada</w:t>
-            </w:r>
-          </w:p>
-        </w:tc>
-        <w:tc>
-          <w:tcPr>
-            <w:tcW w:type="dxa" w:w="6917"/>
-          </w:tcPr>
-          <w:p>
-            <w:r>
-              <w:rPr>
-                <w:sz w:val="19"/>
-              </w:rPr>
-              <w:t>La app es la herramienta; el terapeuta en casa es el adulto, que puede parar cuando haga falta: no hay un mínimo que cumplir.</w:t>
-            </w:r>
-          </w:p>
-        </w:tc>
-      </w:tr>
-    </w:tbl>
-    <w:p>
-      <w:pPr>
-        <w:spacing w:after="40"/>
-      </w:pPr>
-    </w:p>
-    <w:p>
-      <w:pPr>
-        <w:keepNext/>
-        <w:spacing w:after="60" w:before="160"/>
-      </w:pPr>
-      <w:r>
-        <w:rPr>
-          <w:b/>
-          <w:i w:val="0"/>
-          <w:color w:val="4B5563"/>
-          <w:sz w:val="21"/>
-        </w:rPr>
-        <w:t>Flujo principal</w:t>
-      </w:r>
-    </w:p>
-    <w:p>
-      <w:pPr>
-        <w:spacing w:after="60"/>
-        <w:ind w:left="454" w:hanging="255"/>
-      </w:pPr>
-      <w:r>
-        <w:rPr>
-          <w:b/>
-        </w:rPr>
-        <w:t xml:space="preserve">1. </w:t>
-      </w:r>
-      <w:r>
-        <w:rPr>
-          <w:b w:val="0"/>
-        </w:rPr>
-        <w:t xml:space="preserve">En </w:t>
-      </w:r>
-      <w:r>
-        <w:rPr>
-          <w:b/>
-        </w:rPr>
-        <w:t>Prescripción de Terapias</w:t>
-      </w:r>
-      <w:r>
-        <w:rPr>
-          <w:b w:val="0"/>
-        </w:rPr>
-        <w:t xml:space="preserve">, pulsar la tarjeta </w:t>
-      </w:r>
-      <w:r>
-        <w:rPr>
-          <w:b/>
-        </w:rPr>
-        <w:t>“Academy”</w:t>
-      </w:r>
-      <w:r>
-        <w:rPr>
-          <w:b w:val="0"/>
-        </w:rPr>
-        <w:t xml:space="preserve"> (bajo el rótulo “Tu formación”).</w:t>
-      </w:r>
-    </w:p>
-    <w:p>
-      <w:pPr>
-        <w:spacing w:after="60"/>
-        <w:ind w:left="454" w:hanging="255"/>
-      </w:pPr>
-      <w:r>
-        <w:rPr>
-          <w:b/>
-        </w:rPr>
-        <w:t xml:space="preserve">2. </w:t>
-      </w:r>
-      <w:r>
-        <w:rPr>
-          <w:b w:val="0"/>
-        </w:rPr>
-        <w:t xml:space="preserve">Elegir una </w:t>
-      </w:r>
-      <w:r>
-        <w:rPr>
-          <w:b/>
-        </w:rPr>
-        <w:t>Cápsula de Conocimiento</w:t>
-      </w:r>
-      <w:r>
-        <w:rPr>
-          <w:b w:val="0"/>
-        </w:rPr>
-        <w:t xml:space="preserve"> de la lista (unos 2 minutos cada una).</w:t>
-      </w:r>
-    </w:p>
-    <w:p>
-      <w:pPr>
-        <w:spacing w:after="60"/>
-        <w:ind w:left="454" w:hanging="255"/>
-      </w:pPr>
-      <w:r>
-        <w:rPr>
-          <w:b/>
-        </w:rPr>
-        <w:t xml:space="preserve">3. </w:t>
-      </w:r>
-      <w:r>
-        <w:rPr>
-          <w:b w:val="0"/>
-        </w:rPr>
-        <w:t xml:space="preserve">Leer las </w:t>
-      </w:r>
-      <w:r>
-        <w:rPr>
-          <w:b/>
-        </w:rPr>
-        <w:t>diapositivas</w:t>
-      </w:r>
-      <w:r>
-        <w:rPr>
-          <w:b w:val="0"/>
-        </w:rPr>
-        <w:t xml:space="preserve"> avanzando con “Siguiente”.</w:t>
-      </w:r>
-    </w:p>
-    <w:p>
-      <w:pPr>
-        <w:spacing w:after="60"/>
-        <w:ind w:left="454" w:hanging="255"/>
-      </w:pPr>
-      <w:r>
-        <w:rPr>
-          <w:b/>
-        </w:rPr>
-        <w:t xml:space="preserve">4. </w:t>
-      </w:r>
-      <w:r>
-        <w:rPr>
-          <w:b w:val="0"/>
-        </w:rPr>
-        <w:t xml:space="preserve">Responder el </w:t>
-      </w:r>
-      <w:r>
-        <w:rPr>
-          <w:b/>
-        </w:rPr>
-        <w:t>quiz rápido</w:t>
-      </w:r>
-      <w:r>
-        <w:rPr>
-          <w:b w:val="0"/>
-        </w:rPr>
-        <w:t xml:space="preserve"> del final; cada respuesta muestra una breve explicación.</w:t>
-      </w:r>
-    </w:p>
-    <w:p>
-      <w:pPr>
-        <w:spacing w:after="60"/>
-        <w:ind w:left="454" w:hanging="255"/>
-      </w:pPr>
-      <w:r>
-        <w:rPr>
-          <w:b/>
-        </w:rPr>
-        <w:t xml:space="preserve">5. </w:t>
-      </w:r>
-      <w:r>
-        <w:rPr>
-          <w:b w:val="0"/>
-        </w:rPr>
-        <w:t xml:space="preserve">Al aprobar, la app suma </w:t>
-      </w:r>
-      <w:r>
-        <w:rPr>
-          <w:b/>
-        </w:rPr>
-        <w:t>puntos e insignias</w:t>
-      </w:r>
-      <w:r>
-        <w:rPr>
-          <w:b w:val="0"/>
-        </w:rPr>
-        <w:t xml:space="preserve"> y la </w:t>
-      </w:r>
-      <w:r>
-        <w:rPr>
-          <w:b/>
-        </w:rPr>
-        <w:t>barra de la tarjeta avanza al instante</w:t>
-      </w:r>
-      <w:r>
-        <w:rPr>
-          <w:b w:val="0"/>
-        </w:rPr>
-        <w:t>.</w:t>
-      </w:r>
-    </w:p>
-    <w:tbl>
-      <w:tblPr>
-        <w:tblW w:type="auto" w:w="0"/>
-        <w:jc w:val="center"/>
-        <w:tblLook w:firstColumn="1" w:firstRow="1" w:lastColumn="0" w:lastRow="0" w:noHBand="0" w:noVBand="1" w:val="04A0"/>
-      </w:tblPr>
-      <w:tblGrid>
-        <w:gridCol w:w="9638"/>
-      </w:tblGrid>
-      <w:tr>
-        <w:tc>
-          <w:tcPr>
-            <w:tcW w:type="dxa" w:w="9638"/>
-            <w:shd w:val="clear" w:fill="F0FDF9"/>
-          </w:tcPr>
-          <w:p>
-            <w:pPr>
-              <w:spacing w:after="40"/>
-            </w:pPr>
-            <w:r>
-              <w:rPr>
-                <w:b/>
-                <w:color w:val="00A39E"/>
-                <w:sz w:val="17"/>
-              </w:rPr>
-              <w:t>ES PARA EL ADULTO, NO PARA EL NIÑO</w:t>
-            </w:r>
-          </w:p>
-          <w:p>
-            <w:pPr>
-              <w:spacing w:after="40"/>
-            </w:pPr>
-            <w:r>
-              <w:rPr>
-                <w:sz w:val="19"/>
-              </w:rPr>
-              <w:t>Academy vive junto a los menús de la app, que maneja siempre el adulto; la tableta se cede al niño solo cuando el ejercicio ya ha empezado. Por eso el niño no llega por error a esta formación.</w:t>
-            </w:r>
-          </w:p>
-        </w:tc>
-      </w:tr>
-    </w:tbl>
-    <w:p>
-      <w:pPr>
-        <w:spacing w:after="40"/>
-      </w:pPr>
-    </w:p>
-    <w:tbl>
-      <w:tblPr>
-        <w:tblW w:type="auto" w:w="0"/>
-        <w:jc w:val="center"/>
-        <w:tblLook w:firstColumn="1" w:firstRow="1" w:lastColumn="0" w:lastRow="0" w:noHBand="0" w:noVBand="1" w:val="04A0"/>
-      </w:tblPr>
-      <w:tblGrid>
-        <w:gridCol w:w="9638"/>
-      </w:tblGrid>
-      <w:tr>
-        <w:tc>
-          <w:tcPr>
-            <w:tcW w:type="dxa" w:w="9638"/>
-            <w:shd w:val="clear" w:fill="F0FDF9"/>
-          </w:tcPr>
-          <w:p>
-            <w:pPr>
-              <w:spacing w:after="40"/>
-            </w:pPr>
-            <w:r>
-              <w:rPr>
-                <w:b/>
-                <w:color w:val="00A39E"/>
-                <w:sz w:val="17"/>
-              </w:rPr>
-              <w:t>EL PROGRESO NO SE PIERDE</w:t>
-            </w:r>
-          </w:p>
-          <w:p>
-            <w:pPr>
-              <w:spacing w:after="40"/>
-            </w:pPr>
-            <w:r>
-              <w:rPr>
-                <w:sz w:val="19"/>
-              </w:rPr>
-              <w:t>El avance (cápsulas hechas, nivel e insignias) se guarda cifrado en el dispositivo, igual que el resto de datos, y funciona sin conexión.</w:t>
-            </w:r>
-          </w:p>
-        </w:tc>
-      </w:tr>
-    </w:tbl>
-    <w:p>
-      <w:pPr>
-        <w:spacing w:after="40"/>
-      </w:pPr>
-    </w:p>
-    <w:p>
-      <w:r>
-        <w:br w:type="page"/>
-      </w:r>
-    </w:p>
     <w:p>
       <w:pPr>
         <w:keepNext/>
@@ -12345,7 +12422,7 @@
               <w:rPr>
                 <w:sz w:val="19"/>
               </w:rPr>
-              <w:t>Solo se muestra en los ejercicios de Audición si la patología indica audífono o implante coclear (CU-07).</w:t>
+              <w:t>Solo se muestra en los ejercicios de Audición si la patología indica audífono o implante coclear (CU-08).</w:t>
             </w:r>
           </w:p>
         </w:tc>
@@ -12373,7 +12450,7 @@
               <w:rPr>
                 <w:sz w:val="19"/>
               </w:rPr>
-              <w:t>Se perdió porque pasó más de un día sin practicar. Active los recordatorios (CU-09) para evitarlo.</w:t>
+              <w:t>Se perdió porque pasó más de un día sin practicar. Active los recordatorios (CU-10) para evitarlo.</w:t>
             </w:r>
           </w:p>
         </w:tc>
@@ -12401,7 +12478,7 @@
               <w:rPr>
                 <w:sz w:val="19"/>
               </w:rPr>
-              <w:t>Está en Modo Familia (solo lectura). Desbloquee el Modo Profesional con el PIN (CU-05 / CU-12).</w:t>
+              <w:t>Está en Modo Familia (solo lectura). Desbloquee el Modo Profesional con el PIN (CU-06 / CU-13).</w:t>
             </w:r>
           </w:p>
         </w:tc>
@@ -12569,7 +12646,7 @@
               <w:rPr>
                 <w:sz w:val="19"/>
               </w:rPr>
-              <w:t>Desde el hub, tarjeta “Acceso Profesional” con el PIN: la app muestra un QR con el resumen y abre el compartir con el registro completo. Tras enviarlo, los datos se purgan (CU-13).</w:t>
+              <w:t>Desde el hub, tarjeta “Acceso Profesional” con el PIN: la app muestra un QR con el resumen y abre el compartir con el registro completo. Tras enviarlo, los datos se purgan (CU-14).</w:t>
             </w:r>
           </w:p>
         </w:tc>
@@ -12597,7 +12674,7 @@
               <w:rPr>
                 <w:sz w:val="19"/>
               </w:rPr>
-              <w:t>Sí. En la tarjeta “Voz de la app” se elige la variedad (Castellano, Galego o Dominicano). Cambia lo que se locuta y evalúa; los menús siguen en castellano (CU-14).</w:t>
+              <w:t>Sí. En la tarjeta “Voz de la app” se elige la variedad (Castellano, Galego o Dominicano). Cambia lo que se locuta y evalúa; los menús siguen en castellano (CU-15).</w:t>
             </w:r>
           </w:p>
         </w:tc>
@@ -12709,7 +12786,7 @@
               <w:rPr>
                 <w:sz w:val="19"/>
               </w:rPr>
-              <w:t>Son módulos del Panel del Adulto (carga comunicativa) del piloto; solo se activan a mano. Desactívelos desde ese mismo panel (CU-15).</w:t>
+              <w:t>Son módulos del Panel del Adulto (carga comunicativa) del piloto; solo se activan a mano. Desactívelos desde ese mismo panel (CU-16).</w:t>
             </w:r>
           </w:p>
         </w:tc>
@@ -12737,7 +12814,7 @@
               <w:rPr>
                 <w:sz w:val="19"/>
               </w:rPr>
-              <w:t>Es la formación para el adulto: cápsulas breves sobre cómo aprenden a hablar los niños, el porqué del movimiento (TPR) y los vicios a evitar, con un quiz rápido. No es un ejercicio para el niño (CU-16).</w:t>
+              <w:t>Es la formación para el adulto: cápsulas breves sobre cómo aprenden a hablar los niños, el porqué del movimiento (TPR) y los vicios a evitar, con un quiz rápido. No es un ejercicio para el niño (CU-03).</w:t>
             </w:r>
           </w:p>
         </w:tc>

</xml_diff>